<commit_message>
Gorsel alanlarina Shutterstock ID'leri eklendi
- 1.6-3.3 kitap dosyalari, soru ve dijital dosyalardaki gorsel kutularina
  ticari kullanima uygun (editoryal olmayan) Shutterstock ID'leri yazildi
- Yan yana duran gorseller ayni turde (fotograf/vektor); diyagram ve
  infografikler duzenlenebilmesi icin vektor secildi
- Bulunamayanlar (sodyum-su, NO2/N2O4 tupleri, kirec suyu) kutuda notla
  isaretlendi
</commit_message>
<xml_diff>
--- a/Kim11-1-6-Tepkime-Hizi.docx
+++ b/Kim11-1-6-Tepkime-Hizi.docx
@@ -76,7 +76,7 @@
                 <w:rFonts w:ascii="Times New Roman" w:hAnsi="Times New Roman" w:cs="Times New Roman"/>
                 <w:lang w:val="tr-TR"/>
               </w:rPr>
-              <w:t xml:space="preserve">GÖRSEL ALANI (Shutterstock’tan seçilecek)</w:t>
+              <w:t xml:space="preserve">GÖRSEL ALANI (Shutterstock)</w:t>
             </w:r>
           </w:p>
           <w:p>
@@ -108,23 +108,7 @@
                 <w:rFonts w:ascii="Times New Roman" w:hAnsi="Times New Roman" w:cs="Times New Roman"/>
                 <w:lang w:val="tr-TR"/>
               </w:rPr>
-              <w:t xml:space="preserve">Shutterstock arama: “car airbag deployed”</w:t>
-            </w:r>
-          </w:p>
-          <w:p>
-            <w:pPr>
-              <w:jc w:val="both"/>
-              <w:rPr>
-                <w:rFonts w:ascii="Times New Roman" w:hAnsi="Times New Roman" w:cs="Times New Roman"/>
-                <w:lang w:val="tr-TR"/>
-              </w:rPr>
-            </w:pPr>
-            <w:r>
-              <w:rPr>
-                <w:rFonts w:ascii="Times New Roman" w:hAnsi="Times New Roman" w:cs="Times New Roman"/>
-                <w:lang w:val="tr-TR"/>
-              </w:rPr>
-              <w:t xml:space="preserve">Shutter ID: ……………</w:t>
+              <w:t xml:space="preserve">Shutter ID: 2692357243 (fotoğraf) — Deployed airbag on steering wheel after accident</w:t>
             </w:r>
           </w:p>
         </w:tc>
@@ -197,7 +181,7 @@
                 <w:rFonts w:ascii="Times New Roman" w:hAnsi="Times New Roman" w:cs="Times New Roman"/>
                 <w:lang w:val="tr-TR"/>
               </w:rPr>
-              <w:t xml:space="preserve">GÖRSEL ALANI (Shutterstock’tan seçilecek)</w:t>
+              <w:t xml:space="preserve">GÖRSEL ALANI (Shutterstock)</w:t>
             </w:r>
           </w:p>
           <w:p>
@@ -229,23 +213,7 @@
                 <w:rFonts w:ascii="Times New Roman" w:hAnsi="Times New Roman" w:cs="Times New Roman"/>
                 <w:lang w:val="tr-TR"/>
               </w:rPr>
-              <w:t xml:space="preserve">Shutterstock arama: “stalactites stalagmites cave”</w:t>
-            </w:r>
-          </w:p>
-          <w:p>
-            <w:pPr>
-              <w:jc w:val="both"/>
-              <w:rPr>
-                <w:rFonts w:ascii="Times New Roman" w:hAnsi="Times New Roman" w:cs="Times New Roman"/>
-                <w:lang w:val="tr-TR"/>
-              </w:rPr>
-            </w:pPr>
-            <w:r>
-              <w:rPr>
-                <w:rFonts w:ascii="Times New Roman" w:hAnsi="Times New Roman" w:cs="Times New Roman"/>
-                <w:lang w:val="tr-TR"/>
-              </w:rPr>
-              <w:t xml:space="preserve">Shutter ID: ……………</w:t>
+              <w:t xml:space="preserve">Shutter ID: 2746871601 (fotoğraf) — Natural stalactites and stalagmites in limestone cave</w:t>
             </w:r>
           </w:p>
         </w:tc>

</xml_diff>

<commit_message>
Surec becerileri ve programlar arasi bilesenler etkinliklerde acikca vurgulandi (FBAB/KB surec bilesenleri, E, SDB, D, OB davranislari)
</commit_message>
<xml_diff>
--- a/Kim11-1-6-Tepkime-Hizi.docx
+++ b/Kim11-1-6-Tepkime-Hizi.docx
@@ -40,7 +40,7 @@
           <w:rFonts w:ascii="Times New Roman" w:hAnsi="Times New Roman" w:cs="Times New Roman"/>
           <w:lang w:val="tr-TR"/>
         </w:rPr>
-        <w:t>Günlük yaşamda karşılaşılan kimyasal tepkimeler birbirinden çok farklı sürelerde tamamlanır. Bir araç çarpıştığında hava yastığının (Görsel A) şişmesini sağlayan tepkime saniyenin çok küçük bir kesrinde gerçekleşir. Havai fişeklerin patlaması, kibritin alev alması ya da gümüş nitrat ve sodyum klorür çözeltileri karıştırıldığında beyaz renkli çökeleğin oluşması da çok hızlı gerçekleşen tepkimelere örnektir. Buna karşılık demirden yapılmış bir köprünün paslanması yıllar sürebilir. Mağaralardaki sarkıt ve dikitlerin (Görsel B) oluşması ise binlerce yıl alır. Peki bir tepkimenin “hızlı” ya da “yavaş” olduğu nasıl ölçülür? Tepkime ilerledikçe tepkimenin hızı değişir mi? Bir etkinlik yaparak bu soruların cevaplarını keşfediniz.</w:t>
+        <w:t xml:space="preserve">Günlük yaşamda karşılaşılan kimyasal tepkimeler birbirinden çok farklı sürelerde tamamlanır. Bir araç çarpıştığında hava yastığının (Görsel A) şişmesini sağlayan tepkime saniyenin çok küçük bir kesrinde gerçekleşir. Havai fişeklerin patlaması, kibritin alev alması ya da gümüş nitrat ve sodyum klorür çözeltileri karıştırıldığında beyaz renkli çökeleğin oluşması da çok hızlı gerçekleşen tepkimelere örnektir. Buna karşılık demirden yapılmış bir köprünün paslanması yıllar sürebilir. Mağaralardaki sarkıt ve dikitlerin (Görsel B) oluşması ise binlerce yıl alır. Peki bir tepkimenin “hızlı” ya da “yavaş” olduğu nasıl ölçülür? Tepkime ilerledikçe tepkimenin hızı değişir mi? Analiz ve Keşif Atölyesi 1.6.’daki etkinliği yaparak bu soruların cevaplarını keşfediniz. Bu etkinlikte hazır ölçüm verilerinden derişim-zaman grafiği çizecek, grafiğin biçimine ve hesapladığınız ortalama hızlara dayanarak tepkime hızının zamanla nasıl değiştiğini bilimsel veriye dayalı olarak tahmin edeceksiniz. Önermelerinizi arkadaşlarınızla paylaşırken onların sözünü kesmeden dinleyecek, kendi düşüncelerinizi de başkalarının etkisinde kalmadan dile getireceksiniz; böylece iletişim becerinizi ve empati eğiliminizi geliştirirken saygı değerini de desteklemiş olacaksınız.</w:t>
       </w:r>
     </w:p>
     <w:p>
@@ -2044,7 +2044,7 @@
           <w:rFonts w:ascii="Times New Roman" w:hAnsi="Times New Roman" w:cs="Times New Roman"/>
           <w:lang w:val="tr-TR"/>
         </w:rPr>
-        <w:t>Grafiği kullanarak ulaştığınız önermeleri, tepkime hızları ile ilgili önceki bilgilerinize dayalı olarak oluşturduğunuz önermelerle karşılaştırınız. Benzerlik ve farklılıkları yazınız.</w:t>
+        <w:t xml:space="preserve">Grafiği kullanarak ulaştığınız önermeleri, tepkime hızları ile ilgili önceki bilgilerinize dayalı olarak oluşturduğunuz önermelerle karşılaştırınız. Benzerlik ve farklılıkları yazınız. Önermelerinizden hangilerinin tablodaki verilere dayandığını, hangilerinin yalnızca ön bilgilerinize dayandığını belirleyiniz. Verilerle desteklenmeyen önermelerinizi gözden geçiriniz.</w:t>
       </w:r>
     </w:p>
     <w:p>
@@ -2295,7 +2295,67 @@
           <w:rFonts w:ascii="Times New Roman" w:hAnsi="Times New Roman" w:cs="Times New Roman"/>
           <w:lang w:val="tr-TR"/>
         </w:rPr>
-        <w:t>Not kâğıdında verilen eşitlikleri kullanarak aşağıdaki tabloyu doldurunuz.</w:t>
+        <w:t xml:space="preserve">Not kâğıdında verilen eşitlikleri kullanarak her zaman aralığı için N</w:t>
+      </w:r>
+      <w:r>
+        <w:rPr>
+          <w:rFonts w:ascii="Times New Roman" w:hAnsi="Times New Roman" w:cs="Times New Roman"/>
+          <w:lang w:val="tr-TR"/>
+          <w:vertAlign w:val="subscript"/>
+        </w:rPr>
+        <w:t xml:space="preserve">2</w:t>
+      </w:r>
+      <w:r>
+        <w:rPr>
+          <w:rFonts w:ascii="Times New Roman" w:hAnsi="Times New Roman" w:cs="Times New Roman"/>
+          <w:lang w:val="tr-TR"/>
+        </w:rPr>
+        <w:t xml:space="preserve">O</w:t>
+      </w:r>
+      <w:r>
+        <w:rPr>
+          <w:rFonts w:ascii="Times New Roman" w:hAnsi="Times New Roman" w:cs="Times New Roman"/>
+          <w:lang w:val="tr-TR"/>
+          <w:vertAlign w:val="subscript"/>
+        </w:rPr>
+        <w:t xml:space="preserve">5</w:t>
+      </w:r>
+      <w:r>
+        <w:rPr>
+          <w:rFonts w:ascii="Times New Roman" w:hAnsi="Times New Roman" w:cs="Times New Roman"/>
+          <w:lang w:val="tr-TR"/>
+        </w:rPr>
+        <w:t xml:space="preserve">’in ortalama harcanma hızını, NO</w:t>
+      </w:r>
+      <w:r>
+        <w:rPr>
+          <w:rFonts w:ascii="Times New Roman" w:hAnsi="Times New Roman" w:cs="Times New Roman"/>
+          <w:lang w:val="tr-TR"/>
+          <w:vertAlign w:val="subscript"/>
+        </w:rPr>
+        <w:t xml:space="preserve">2</w:t>
+      </w:r>
+      <w:r>
+        <w:rPr>
+          <w:rFonts w:ascii="Times New Roman" w:hAnsi="Times New Roman" w:cs="Times New Roman"/>
+          <w:lang w:val="tr-TR"/>
+        </w:rPr>
+        <w:t xml:space="preserve"> ve O</w:t>
+      </w:r>
+      <w:r>
+        <w:rPr>
+          <w:rFonts w:ascii="Times New Roman" w:hAnsi="Times New Roman" w:cs="Times New Roman"/>
+          <w:lang w:val="tr-TR"/>
+          <w:vertAlign w:val="subscript"/>
+        </w:rPr>
+        <w:t xml:space="preserve">2</w:t>
+      </w:r>
+      <w:r>
+        <w:rPr>
+          <w:rFonts w:ascii="Times New Roman" w:hAnsi="Times New Roman" w:cs="Times New Roman"/>
+          <w:lang w:val="tr-TR"/>
+        </w:rPr>
+        <w:t xml:space="preserve">’nin ortalama oluşum hızlarını hesaplayınız ve sonuçlarınızı aşağıdaki tabloya yazınız.</w:t>
       </w:r>
     </w:p>
     <w:tbl>

</xml_diff>

<commit_message>
1.6: Dinitrojen pentoksit -> Diazot pentoksit (Turkce adlandirma)
</commit_message>
<xml_diff>
--- a/Kim11-1-6-Tepkime-Hizi.docx
+++ b/Kim11-1-6-Tepkime-Hizi.docx
@@ -40,7 +40,7 @@
           <w:rFonts w:ascii="Times New Roman" w:hAnsi="Times New Roman" w:cs="Times New Roman"/>
           <w:lang w:val="tr-TR"/>
         </w:rPr>
-        <w:t xml:space="preserve">Günlük yaşamda karşılaşılan kimyasal tepkimeler birbirinden çok farklı sürelerde tamamlanır. Bir araç çarpıştığında hava yastığının (Görsel A) şişmesini sağlayan tepkime saniyenin çok küçük bir kesrinde gerçekleşir. Havai fişeklerin patlaması, kibritin alev alması ya da gümüş nitrat ve sodyum klorür çözeltileri karıştırıldığında beyaz renkli çökeleğin oluşması da çok hızlı gerçekleşen tepkimelere örnektir. Buna karşılık demirden yapılmış bir köprünün paslanması yıllar sürebilir. Mağaralardaki sarkıt ve dikitlerin (Görsel B) oluşması ise binlerce yıl alır. Peki bir tepkimenin “hızlı” ya da “yavaş” olduğu nasıl ölçülür? Tepkime ilerledikçe tepkimenin hızı değişir mi? Analiz ve Keşif Atölyesi 1.6.’daki etkinliği yaparak bu soruların cevaplarını keşfediniz. Bu etkinlikte hazır ölçüm verilerinden derişim-zaman grafiği çizecek, grafiğin biçimine ve hesapladığınız ortalama hızlara dayanarak tepkime hızının zamanla nasıl değiştiğini bilimsel veriye dayalı olarak tahmin edeceksiniz. Önermelerinizi arkadaşlarınızla paylaşırken onların sözünü kesmeden dinleyecek, kendi düşüncelerinizi de başkalarının etkisinde kalmadan dile getireceksiniz; böylece iletişim becerinizi ve empati eğiliminizi geliştirirken saygı değerini de desteklemiş olacaksınız.</w:t>
+        <w:t>Günlük yaşamda karşılaşılan kimyasal tepkimeler birbirinden çok farklı sürelerde tamamlanır. Bir araç çarpıştığında hava yastığının (Görsel A) şişmesini sağlayan tepkime saniyenin çok küçük bir kesrinde gerçekleşir. Havai fişeklerin patlaması, kibritin alev alması ya da gümüş nitrat ve sodyum klorür çözeltileri karıştırıldığında beyaz renkli çökeleğin oluşması da çok hızlı gerçekleşen tepkimelere örnektir. Buna karşılık demirden yapılmış bir köprünün paslanması yıllar sürebilir. Mağaralardaki sarkıt ve dikitlerin (Görsel B) oluşması ise binlerce yıl alır. Peki bir tepkimenin “hızlı” ya da “yavaş” olduğu nasıl ölçülür? Tepkime ilerledikçe tepkimenin hızı değişir mi? Analiz ve Keşif Atölyesi 1.6.’daki etkinliği yaparak bu soruların cevaplarını keşfediniz. Bu etkinlikte hazır ölçüm verilerinden derişim-zaman grafiği çizecek, grafiğin biçimine ve hesapladığınız ortalama hızlara dayanarak tepkime hızının zamanla nasıl değiştiğini bilimsel veriye dayalı olarak tahmin edeceksiniz. Önermelerinizi arkadaşlarınızla paylaşırken onların sözünü kesmeden dinleyecek, kendi düşüncelerinizi de başkalarının etkisinde kalmadan dile getireceksiniz; böylece iletişim becerinizi ve empati eğiliminizi geliştirirken saygı değerini de desteklemiş olacaksınız.</w:t>
       </w:r>
     </w:p>
     <w:p>
@@ -74,7 +74,7 @@
           <w:noProof/>
         </w:rPr>
         <w:drawing>
-          <wp:inline distT="0" distB="0" distL="0" distR="0" wp14:anchorId="65D1719E" wp14:editId="0F7B25C7">
+          <wp:inline distT="0" distB="0" distL="0" distR="0" wp14:anchorId="65D1719E" wp14:editId="1AA27922">
             <wp:extent cx="5943600" cy="4358640"/>
             <wp:effectExtent l="0" t="0" r="0" b="0"/>
             <wp:docPr id="1545737045" name="Picture 7" descr="Opened airbag in automobile. Car safety equipment"/>
@@ -156,8 +156,9 @@
           <w:highlight w:val="yellow"/>
           <w:lang w:val="tr-TR"/>
         </w:rPr>
-        <w:t xml:space="preserve"> id: </w:t>
-      </w:r>
+        <w:t xml:space="preserve"> id: 2544396155 (</w:t>
+      </w:r>
+      <w:proofErr w:type="spellStart"/>
       <w:r>
         <w:rPr>
           <w:rFonts w:ascii="Times New Roman" w:hAnsi="Times New Roman" w:cs="Times New Roman"/>
@@ -166,8 +167,9 @@
           <w:highlight w:val="yellow"/>
           <w:lang w:val="tr-TR"/>
         </w:rPr>
-        <w:t>2544396155</w:t>
-      </w:r>
+        <w:t>foroğraf</w:t>
+      </w:r>
+      <w:proofErr w:type="spellEnd"/>
       <w:r>
         <w:rPr>
           <w:rFonts w:ascii="Times New Roman" w:hAnsi="Times New Roman" w:cs="Times New Roman"/>
@@ -176,7 +178,7 @@
           <w:highlight w:val="yellow"/>
           <w:lang w:val="tr-TR"/>
         </w:rPr>
-        <w:t xml:space="preserve"> (</w:t>
+        <w:t xml:space="preserve">) — </w:t>
       </w:r>
       <w:proofErr w:type="spellStart"/>
       <w:r>
@@ -187,7 +189,7 @@
           <w:highlight w:val="yellow"/>
           <w:lang w:val="tr-TR"/>
         </w:rPr>
-        <w:t>foroğraf</w:t>
+        <w:t>Opened</w:t>
       </w:r>
       <w:proofErr w:type="spellEnd"/>
       <w:r>
@@ -198,8 +200,9 @@
           <w:highlight w:val="yellow"/>
           <w:lang w:val="tr-TR"/>
         </w:rPr>
-        <w:t xml:space="preserve">) </w:t>
-      </w:r>
+        <w:t xml:space="preserve"> </w:t>
+      </w:r>
+      <w:proofErr w:type="spellStart"/>
       <w:r>
         <w:rPr>
           <w:rFonts w:ascii="Times New Roman" w:hAnsi="Times New Roman" w:cs="Times New Roman"/>
@@ -208,9 +211,9 @@
           <w:highlight w:val="yellow"/>
           <w:lang w:val="tr-TR"/>
         </w:rPr>
-        <w:t xml:space="preserve">— </w:t>
-      </w:r>
-      <w:proofErr w:type="spellStart"/>
+        <w:t>airbag</w:t>
+      </w:r>
+      <w:proofErr w:type="spellEnd"/>
       <w:r>
         <w:rPr>
           <w:rFonts w:ascii="Times New Roman" w:hAnsi="Times New Roman" w:cs="Times New Roman"/>
@@ -219,9 +222,9 @@
           <w:highlight w:val="yellow"/>
           <w:lang w:val="tr-TR"/>
         </w:rPr>
-        <w:t>Opened</w:t>
-      </w:r>
-      <w:proofErr w:type="spellEnd"/>
+        <w:t xml:space="preserve"> in </w:t>
+      </w:r>
+      <w:proofErr w:type="spellStart"/>
       <w:r>
         <w:rPr>
           <w:rFonts w:ascii="Times New Roman" w:hAnsi="Times New Roman" w:cs="Times New Roman"/>
@@ -230,9 +233,9 @@
           <w:highlight w:val="yellow"/>
           <w:lang w:val="tr-TR"/>
         </w:rPr>
-        <w:t xml:space="preserve"> </w:t>
-      </w:r>
-      <w:proofErr w:type="spellStart"/>
+        <w:t>automobile</w:t>
+      </w:r>
+      <w:proofErr w:type="spellEnd"/>
       <w:r>
         <w:rPr>
           <w:rFonts w:ascii="Times New Roman" w:hAnsi="Times New Roman" w:cs="Times New Roman"/>
@@ -241,9 +244,9 @@
           <w:highlight w:val="yellow"/>
           <w:lang w:val="tr-TR"/>
         </w:rPr>
-        <w:t>airbag</w:t>
-      </w:r>
-      <w:proofErr w:type="spellEnd"/>
+        <w:t xml:space="preserve">. Car </w:t>
+      </w:r>
+      <w:proofErr w:type="spellStart"/>
       <w:r>
         <w:rPr>
           <w:rFonts w:ascii="Times New Roman" w:hAnsi="Times New Roman" w:cs="Times New Roman"/>
@@ -252,9 +255,9 @@
           <w:highlight w:val="yellow"/>
           <w:lang w:val="tr-TR"/>
         </w:rPr>
-        <w:t xml:space="preserve"> in </w:t>
-      </w:r>
-      <w:proofErr w:type="spellStart"/>
+        <w:t>safety</w:t>
+      </w:r>
+      <w:proofErr w:type="spellEnd"/>
       <w:r>
         <w:rPr>
           <w:rFonts w:ascii="Times New Roman" w:hAnsi="Times New Roman" w:cs="Times New Roman"/>
@@ -263,9 +266,9 @@
           <w:highlight w:val="yellow"/>
           <w:lang w:val="tr-TR"/>
         </w:rPr>
-        <w:t>automobile</w:t>
-      </w:r>
-      <w:proofErr w:type="spellEnd"/>
+        <w:t xml:space="preserve"> </w:t>
+      </w:r>
+      <w:proofErr w:type="spellStart"/>
       <w:r>
         <w:rPr>
           <w:rFonts w:ascii="Times New Roman" w:hAnsi="Times New Roman" w:cs="Times New Roman"/>
@@ -274,42 +277,35 @@
           <w:highlight w:val="yellow"/>
           <w:lang w:val="tr-TR"/>
         </w:rPr>
-        <w:t xml:space="preserve">. Car </w:t>
-      </w:r>
-      <w:proofErr w:type="spellStart"/>
+        <w:t>equipment</w:t>
+      </w:r>
+      <w:proofErr w:type="spellEnd"/>
+    </w:p>
+    <w:p>
+      <w:pPr>
+        <w:jc w:val="center"/>
+        <w:rPr>
+          <w:rFonts w:ascii="Times New Roman" w:hAnsi="Times New Roman" w:cs="Times New Roman"/>
+          <w:lang w:val="tr-TR"/>
+        </w:rPr>
+      </w:pPr>
       <w:r>
         <w:rPr>
           <w:rFonts w:ascii="Times New Roman" w:hAnsi="Times New Roman" w:cs="Times New Roman"/>
           <w:b/>
           <w:bCs/>
-          <w:highlight w:val="yellow"/>
-          <w:lang w:val="tr-TR"/>
-        </w:rPr>
-        <w:t>safety</w:t>
-      </w:r>
-      <w:proofErr w:type="spellEnd"/>
-      <w:r>
-        <w:rPr>
-          <w:rFonts w:ascii="Times New Roman" w:hAnsi="Times New Roman" w:cs="Times New Roman"/>
-          <w:b/>
-          <w:bCs/>
-          <w:highlight w:val="yellow"/>
-          <w:lang w:val="tr-TR"/>
-        </w:rPr>
-        <w:t xml:space="preserve"> </w:t>
-      </w:r>
-      <w:proofErr w:type="spellStart"/>
-      <w:r>
-        <w:rPr>
-          <w:rFonts w:ascii="Times New Roman" w:hAnsi="Times New Roman" w:cs="Times New Roman"/>
-          <w:b/>
-          <w:bCs/>
-          <w:highlight w:val="yellow"/>
-          <w:lang w:val="tr-TR"/>
-        </w:rPr>
-        <w:t>equipment</w:t>
-      </w:r>
-      <w:proofErr w:type="spellEnd"/>
+          <w:lang w:val="tr-TR"/>
+        </w:rPr>
+        <w:lastRenderedPageBreak/>
+        <w:t>Görsel A:</w:t>
+      </w:r>
+      <w:r>
+        <w:rPr>
+          <w:rFonts w:ascii="Times New Roman" w:hAnsi="Times New Roman" w:cs="Times New Roman"/>
+          <w:lang w:val="tr-TR"/>
+        </w:rPr>
+        <w:t xml:space="preserve"> Hava yastığının açılması</w:t>
+      </w:r>
     </w:p>
     <w:p>
       <w:pPr>
@@ -319,22 +315,6 @@
           <w:lang w:val="tr-TR"/>
         </w:rPr>
       </w:pPr>
-      <w:r>
-        <w:rPr>
-          <w:rFonts w:ascii="Times New Roman" w:hAnsi="Times New Roman" w:cs="Times New Roman"/>
-          <w:b/>
-          <w:bCs/>
-          <w:lang w:val="tr-TR"/>
-        </w:rPr>
-        <w:t>Görsel A:</w:t>
-      </w:r>
-      <w:r>
-        <w:rPr>
-          <w:rFonts w:ascii="Times New Roman" w:hAnsi="Times New Roman" w:cs="Times New Roman"/>
-          <w:lang w:val="tr-TR"/>
-        </w:rPr>
-        <w:t xml:space="preserve"> Hava yastığının açılması</w:t>
-      </w:r>
     </w:p>
     <w:p>
       <w:pPr>
@@ -347,32 +327,22 @@
     </w:p>
     <w:p>
       <w:pPr>
-        <w:jc w:val="center"/>
-        <w:rPr>
-          <w:rFonts w:ascii="Times New Roman" w:hAnsi="Times New Roman" w:cs="Times New Roman"/>
-          <w:lang w:val="tr-TR"/>
-        </w:rPr>
-      </w:pPr>
-    </w:p>
-    <w:p>
-      <w:pPr>
-        <w:jc w:val="both"/>
-        <w:rPr>
-          <w:rFonts w:ascii="Times New Roman" w:hAnsi="Times New Roman" w:cs="Times New Roman"/>
-          <w:lang w:val="tr-TR"/>
-        </w:rPr>
-      </w:pPr>
-    </w:p>
-    <w:p>
-      <w:pPr>
-        <w:jc w:val="both"/>
-        <w:rPr>
-          <w:rFonts w:ascii="Times New Roman" w:hAnsi="Times New Roman" w:cs="Times New Roman"/>
-          <w:lang w:val="tr-TR"/>
-        </w:rPr>
-      </w:pPr>
-      <w:r>
-        <w:lastRenderedPageBreak/>
+        <w:jc w:val="both"/>
+        <w:rPr>
+          <w:rFonts w:ascii="Times New Roman" w:hAnsi="Times New Roman" w:cs="Times New Roman"/>
+          <w:lang w:val="tr-TR"/>
+        </w:rPr>
+      </w:pPr>
+    </w:p>
+    <w:p>
+      <w:pPr>
+        <w:jc w:val="both"/>
+        <w:rPr>
+          <w:rFonts w:ascii="Times New Roman" w:hAnsi="Times New Roman" w:cs="Times New Roman"/>
+          <w:lang w:val="tr-TR"/>
+        </w:rPr>
+      </w:pPr>
+      <w:r>
         <w:fldChar w:fldCharType="begin"/>
       </w:r>
       <w:r>
@@ -386,7 +356,7 @@
           <w:noProof/>
         </w:rPr>
         <w:drawing>
-          <wp:inline distT="0" distB="0" distL="0" distR="0" wp14:anchorId="30FF1CD9" wp14:editId="55509544">
+          <wp:inline distT="0" distB="0" distL="0" distR="0" wp14:anchorId="30FF1CD9" wp14:editId="46B7F799">
             <wp:extent cx="5943600" cy="4366260"/>
             <wp:effectExtent l="0" t="0" r="0" b="2540"/>
             <wp:docPr id="1116089368" name="Picture 8" descr="Natural stalactites and stalagmites speleothems in limestone cave with illuminated lighting."/>
@@ -598,6 +568,15 @@
     </w:p>
     <w:p>
       <w:pPr>
+        <w:jc w:val="center"/>
+        <w:rPr>
+          <w:rFonts w:ascii="Times New Roman" w:hAnsi="Times New Roman" w:cs="Times New Roman"/>
+          <w:lang w:val="tr-TR"/>
+        </w:rPr>
+      </w:pPr>
+    </w:p>
+    <w:p>
+      <w:pPr>
         <w:keepNext/>
         <w:shd w:val="clear" w:color="auto" w:fill="A5C9EB"/>
         <w:jc w:val="both"/>
@@ -631,7 +610,7 @@
           <w:rFonts w:ascii="Times New Roman" w:hAnsi="Times New Roman" w:cs="Times New Roman"/>
           <w:lang w:val="tr-TR"/>
         </w:rPr>
-        <w:t>Dinitrojen pentoksit (N</w:t>
+        <w:t>Diazot pentoksit (N</w:t>
       </w:r>
       <w:r>
         <w:rPr>
@@ -773,6 +752,7 @@
           <w:bCs/>
           <w:lang w:val="tr-TR"/>
         </w:rPr>
+        <w:lastRenderedPageBreak/>
         <w:t>Tablo: 2N</w:t>
       </w:r>
       <w:r>
@@ -1270,7 +1250,6 @@
                 <w:rFonts w:ascii="Times New Roman" w:hAnsi="Times New Roman" w:cs="Times New Roman"/>
                 <w:lang w:val="tr-TR"/>
               </w:rPr>
-              <w:lastRenderedPageBreak/>
               <w:t>800</w:t>
             </w:r>
           </w:p>
@@ -1916,6 +1895,7 @@
           <w:rFonts w:ascii="Times New Roman" w:hAnsi="Times New Roman" w:cs="Times New Roman"/>
           <w:lang w:val="tr-TR"/>
         </w:rPr>
+        <w:lastRenderedPageBreak/>
         <w:t>……………………………………………………………………………………………</w:t>
       </w:r>
     </w:p>
@@ -1971,7 +1951,6 @@
           <w:rFonts w:ascii="Times New Roman" w:hAnsi="Times New Roman" w:cs="Times New Roman"/>
           <w:lang w:val="tr-TR"/>
         </w:rPr>
-        <w:lastRenderedPageBreak/>
         <w:t>Oluşturduğunuz önermeleri arkadaşlarınızla paylaşınız. Paylaşım sırasında düşünce ve izlenimlerinizi etki altında kalmadan ifade ediniz, arkadaşlarınızın sözünü kesmeden onları etkin bir şekilde dinleyiniz ve farklı bakış açılarını anlamaya çalışınız.</w:t>
       </w:r>
     </w:p>
@@ -2044,7 +2023,7 @@
           <w:rFonts w:ascii="Times New Roman" w:hAnsi="Times New Roman" w:cs="Times New Roman"/>
           <w:lang w:val="tr-TR"/>
         </w:rPr>
-        <w:t xml:space="preserve">Grafiği kullanarak ulaştığınız önermeleri, tepkime hızları ile ilgili önceki bilgilerinize dayalı olarak oluşturduğunuz önermelerle karşılaştırınız. Benzerlik ve farklılıkları yazınız. Önermelerinizden hangilerinin tablodaki verilere dayandığını, hangilerinin yalnızca ön bilgilerinize dayandığını belirleyiniz. Verilerle desteklenmeyen önermelerinizi gözden geçiriniz.</w:t>
+        <w:t>Grafiği kullanarak ulaştığınız önermeleri, tepkime hızları ile ilgili önceki bilgilerinize dayalı olarak oluşturduğunuz önermelerle karşılaştırınız. Benzerlik ve farklılıkları yazınız. Önermelerinizden hangilerinin tablodaki verilere dayandığını, hangilerinin yalnızca ön bilgilerinize dayandığını belirleyiniz. Verilerle desteklenmeyen önermelerinizi gözden geçiriniz.</w:t>
       </w:r>
     </w:p>
     <w:p>
@@ -2295,45 +2274,45 @@
           <w:rFonts w:ascii="Times New Roman" w:hAnsi="Times New Roman" w:cs="Times New Roman"/>
           <w:lang w:val="tr-TR"/>
         </w:rPr>
-        <w:t xml:space="preserve">Not kâğıdında verilen eşitlikleri kullanarak her zaman aralığı için N</w:t>
-      </w:r>
-      <w:r>
-        <w:rPr>
-          <w:rFonts w:ascii="Times New Roman" w:hAnsi="Times New Roman" w:cs="Times New Roman"/>
-          <w:lang w:val="tr-TR"/>
-          <w:vertAlign w:val="subscript"/>
-        </w:rPr>
-        <w:t xml:space="preserve">2</w:t>
-      </w:r>
-      <w:r>
-        <w:rPr>
-          <w:rFonts w:ascii="Times New Roman" w:hAnsi="Times New Roman" w:cs="Times New Roman"/>
-          <w:lang w:val="tr-TR"/>
-        </w:rPr>
-        <w:t xml:space="preserve">O</w:t>
-      </w:r>
-      <w:r>
-        <w:rPr>
-          <w:rFonts w:ascii="Times New Roman" w:hAnsi="Times New Roman" w:cs="Times New Roman"/>
-          <w:lang w:val="tr-TR"/>
-          <w:vertAlign w:val="subscript"/>
-        </w:rPr>
-        <w:t xml:space="preserve">5</w:t>
-      </w:r>
-      <w:r>
-        <w:rPr>
-          <w:rFonts w:ascii="Times New Roman" w:hAnsi="Times New Roman" w:cs="Times New Roman"/>
-          <w:lang w:val="tr-TR"/>
-        </w:rPr>
-        <w:t xml:space="preserve">’in ortalama harcanma hızını, NO</w:t>
-      </w:r>
-      <w:r>
-        <w:rPr>
-          <w:rFonts w:ascii="Times New Roman" w:hAnsi="Times New Roman" w:cs="Times New Roman"/>
-          <w:lang w:val="tr-TR"/>
-          <w:vertAlign w:val="subscript"/>
-        </w:rPr>
-        <w:t xml:space="preserve">2</w:t>
+        <w:t>Not kâğıdında verilen eşitlikleri kullanarak her zaman aralığı için N</w:t>
+      </w:r>
+      <w:r>
+        <w:rPr>
+          <w:rFonts w:ascii="Times New Roman" w:hAnsi="Times New Roman" w:cs="Times New Roman"/>
+          <w:vertAlign w:val="subscript"/>
+          <w:lang w:val="tr-TR"/>
+        </w:rPr>
+        <w:t>2</w:t>
+      </w:r>
+      <w:r>
+        <w:rPr>
+          <w:rFonts w:ascii="Times New Roman" w:hAnsi="Times New Roman" w:cs="Times New Roman"/>
+          <w:lang w:val="tr-TR"/>
+        </w:rPr>
+        <w:t>O</w:t>
+      </w:r>
+      <w:r>
+        <w:rPr>
+          <w:rFonts w:ascii="Times New Roman" w:hAnsi="Times New Roman" w:cs="Times New Roman"/>
+          <w:vertAlign w:val="subscript"/>
+          <w:lang w:val="tr-TR"/>
+        </w:rPr>
+        <w:t>5</w:t>
+      </w:r>
+      <w:r>
+        <w:rPr>
+          <w:rFonts w:ascii="Times New Roman" w:hAnsi="Times New Roman" w:cs="Times New Roman"/>
+          <w:lang w:val="tr-TR"/>
+        </w:rPr>
+        <w:t>’in ortalama harcanma hızını, NO</w:t>
+      </w:r>
+      <w:r>
+        <w:rPr>
+          <w:rFonts w:ascii="Times New Roman" w:hAnsi="Times New Roman" w:cs="Times New Roman"/>
+          <w:vertAlign w:val="subscript"/>
+          <w:lang w:val="tr-TR"/>
+        </w:rPr>
+        <w:t>2</w:t>
       </w:r>
       <w:r>
         <w:rPr>
@@ -2345,17 +2324,17 @@
       <w:r>
         <w:rPr>
           <w:rFonts w:ascii="Times New Roman" w:hAnsi="Times New Roman" w:cs="Times New Roman"/>
-          <w:lang w:val="tr-TR"/>
-          <w:vertAlign w:val="subscript"/>
-        </w:rPr>
-        <w:t xml:space="preserve">2</w:t>
-      </w:r>
-      <w:r>
-        <w:rPr>
-          <w:rFonts w:ascii="Times New Roman" w:hAnsi="Times New Roman" w:cs="Times New Roman"/>
-          <w:lang w:val="tr-TR"/>
-        </w:rPr>
-        <w:t xml:space="preserve">’nin ortalama oluşum hızlarını hesaplayınız ve sonuçlarınızı aşağıdaki tabloya yazınız.</w:t>
+          <w:vertAlign w:val="subscript"/>
+          <w:lang w:val="tr-TR"/>
+        </w:rPr>
+        <w:t>2</w:t>
+      </w:r>
+      <w:r>
+        <w:rPr>
+          <w:rFonts w:ascii="Times New Roman" w:hAnsi="Times New Roman" w:cs="Times New Roman"/>
+          <w:lang w:val="tr-TR"/>
+        </w:rPr>
+        <w:t>’nin ortalama oluşum hızlarını hesaplayınız ve sonuçlarınızı aşağıdaki tabloya yazınız.</w:t>
       </w:r>
     </w:p>
     <w:tbl>
@@ -2406,6 +2385,7 @@
                 <w:bCs/>
                 <w:lang w:val="tr-TR"/>
               </w:rPr>
+              <w:lastRenderedPageBreak/>
               <w:t>Zaman aralığı (s)</w:t>
             </w:r>
           </w:p>
@@ -3204,6 +3184,7 @@
           <w:noProof/>
           <w:lang w:val="tr-TR"/>
         </w:rPr>
+        <w:lastRenderedPageBreak/>
         <mc:AlternateContent>
           <mc:Choice Requires="wps">
             <w:drawing>
@@ -3418,37 +3399,37 @@
           <w:rFonts w:ascii="Times New Roman" w:hAnsi="Times New Roman" w:cs="Times New Roman"/>
           <w:lang w:val="tr-TR"/>
         </w:rPr>
-        <w:t xml:space="preserve">Analiz ve Keşif Atölyesi 1.6.’da N</w:t>
-      </w:r>
-      <w:r>
-        <w:rPr>
-          <w:rFonts w:ascii="Times New Roman" w:hAnsi="Times New Roman" w:cs="Times New Roman"/>
-          <w:lang w:val="tr-TR"/>
-          <w:vertAlign w:val="subscript"/>
-        </w:rPr>
-        <w:t xml:space="preserve">2</w:t>
-      </w:r>
-      <w:r>
-        <w:rPr>
-          <w:rFonts w:ascii="Times New Roman" w:hAnsi="Times New Roman" w:cs="Times New Roman"/>
-          <w:lang w:val="tr-TR"/>
-        </w:rPr>
-        <w:t xml:space="preserve">O</w:t>
-      </w:r>
-      <w:r>
-        <w:rPr>
-          <w:rFonts w:ascii="Times New Roman" w:hAnsi="Times New Roman" w:cs="Times New Roman"/>
-          <w:lang w:val="tr-TR"/>
-          <w:vertAlign w:val="subscript"/>
-        </w:rPr>
-        <w:t xml:space="preserve">5</w:t>
-      </w:r>
-      <w:r>
-        <w:rPr>
-          <w:rFonts w:ascii="Times New Roman" w:hAnsi="Times New Roman" w:cs="Times New Roman"/>
-          <w:lang w:val="tr-TR"/>
-        </w:rPr>
-        <w:t xml:space="preserve">’in bozunmasını incelerken tepkimenin ne kadar hızlı ilerlediğini, tepken ve ürün derişimlerinin zamanla nasıl değiştiğine bakarak değerlendirdiniz. Kimyasal tepkimelerin ne kadar hızlı gerçekleştiğini inceleyen kimya dalına kimyasal kinetik denir. Bir tepkimenin hızı, tepkime sırasında tepkenlerin harcanma ya da ürünlerin oluşma hızı ile ifade edilir. Çizdiğiniz grafikte de görüldüğü gibi tepkime ilerledikçe tepkenlerin derişimi azalırken ürünlerin derişimi artar. Bu nedenle tepkime hızı, birim zamanda tepken derişimindeki azalma ya da ürün derişimindeki artış olarak tanımlanır. Derişim mol/L, zaman saniye (s) cinsinden alındığında tepkime hızının birimi mol/L·s (M/s) olur. Bazı yavaş tepkimelerde zaman birimi olarak dakika veya saat de kullanılabilir.</w:t>
+        <w:t>Analiz ve Keşif Atölyesi 1.6.’da N</w:t>
+      </w:r>
+      <w:r>
+        <w:rPr>
+          <w:rFonts w:ascii="Times New Roman" w:hAnsi="Times New Roman" w:cs="Times New Roman"/>
+          <w:vertAlign w:val="subscript"/>
+          <w:lang w:val="tr-TR"/>
+        </w:rPr>
+        <w:t>2</w:t>
+      </w:r>
+      <w:r>
+        <w:rPr>
+          <w:rFonts w:ascii="Times New Roman" w:hAnsi="Times New Roman" w:cs="Times New Roman"/>
+          <w:lang w:val="tr-TR"/>
+        </w:rPr>
+        <w:t>O</w:t>
+      </w:r>
+      <w:r>
+        <w:rPr>
+          <w:rFonts w:ascii="Times New Roman" w:hAnsi="Times New Roman" w:cs="Times New Roman"/>
+          <w:vertAlign w:val="subscript"/>
+          <w:lang w:val="tr-TR"/>
+        </w:rPr>
+        <w:t>5</w:t>
+      </w:r>
+      <w:r>
+        <w:rPr>
+          <w:rFonts w:ascii="Times New Roman" w:hAnsi="Times New Roman" w:cs="Times New Roman"/>
+          <w:lang w:val="tr-TR"/>
+        </w:rPr>
+        <w:t>’in bozunmasını incelerken tepkimenin ne kadar hızlı ilerlediğini, tepken ve ürün derişimlerinin zamanla nasıl değiştiğine bakarak değerlendirdiniz. Kimyasal tepkimelerin ne kadar hızlı gerçekleştiğini inceleyen kimya dalına kimyasal kinetik denir. Bir tepkimenin hızı, tepkime sırasında tepkenlerin harcanma ya da ürünlerin oluşma hızı ile ifade edilir. Çizdiğiniz grafikte de görüldüğü gibi tepkime ilerledikçe tepkenlerin derişimi azalırken ürünlerin derişimi artar. Bu nedenle tepkime hızı, birim zamanda tepken derişimindeki azalma ya da ürün derişimindeki artış olarak tanımlanır. Derişim mol/L, zaman saniye (s) cinsinden alındığında tepkime hızının birimi mol/L·s (M/s) olur. Bazı yavaş tepkimelerde zaman birimi olarak dakika veya saat de kullanılabilir.</w:t>
       </w:r>
     </w:p>
     <w:p>
@@ -3737,6 +3718,7 @@
           <w:highlight w:val="yellow"/>
           <w:lang w:val="tr-TR"/>
         </w:rPr>
+        <w:lastRenderedPageBreak/>
         <w:t xml:space="preserve">NOT: </w:t>
       </w:r>
       <w:r>
@@ -3761,7 +3743,7 @@
           <w:rFonts w:ascii="Times New Roman" w:hAnsi="Times New Roman" w:cs="Times New Roman"/>
           <w:lang w:val="tr-TR"/>
         </w:rPr>
-        <w:t xml:space="preserve">Atölyede her zaman aralığı için ayrı bir hız hesapladınız ve bu değerlerin birbirinden farklı olduğunu fark ettiniz. Bu nedenle hesaplanan her değer yalnızca seçilen zaman aralığını temsil eder. Belirli bir zaman aralığında tepken ya da ürün derişimindeki değişimin bu zaman aralığına oranına ortalama tepkime hızı denir. aA + bB → cC + dD genel tepkimesi için tepken ve ürünlere göre ortalama hız ifadeleri aşağıdaki gibi yazılır:</w:t>
+        <w:t>Atölyede her zaman aralığı için ayrı bir hız hesapladınız ve bu değerlerin birbirinden farklı olduğunu fark ettiniz. Bu nedenle hesaplanan her değer yalnızca seçilen zaman aralığını temsil eder. Belirli bir zaman aralığında tepken ya da ürün derişimindeki değişimin bu zaman aralığına oranına ortalama tepkime hızı denir. aA + bB → cC + dD genel tepkimesi için tepken ve ürünlere göre ortalama hız ifadeleri aşağıdaki gibi yazılır:</w:t>
       </w:r>
     </w:p>
     <w:p>
@@ -3876,45 +3858,45 @@
           <w:rFonts w:ascii="Times New Roman" w:hAnsi="Times New Roman" w:cs="Times New Roman"/>
           <w:lang w:val="tr-TR"/>
         </w:rPr>
-        <w:t xml:space="preserve">Atölyede aynı zaman aralığında N</w:t>
-      </w:r>
-      <w:r>
-        <w:rPr>
-          <w:rFonts w:ascii="Times New Roman" w:hAnsi="Times New Roman" w:cs="Times New Roman"/>
-          <w:lang w:val="tr-TR"/>
-          <w:vertAlign w:val="subscript"/>
-        </w:rPr>
-        <w:t xml:space="preserve">2</w:t>
-      </w:r>
-      <w:r>
-        <w:rPr>
-          <w:rFonts w:ascii="Times New Roman" w:hAnsi="Times New Roman" w:cs="Times New Roman"/>
-          <w:lang w:val="tr-TR"/>
-        </w:rPr>
-        <w:t xml:space="preserve">O</w:t>
-      </w:r>
-      <w:r>
-        <w:rPr>
-          <w:rFonts w:ascii="Times New Roman" w:hAnsi="Times New Roman" w:cs="Times New Roman"/>
-          <w:lang w:val="tr-TR"/>
-          <w:vertAlign w:val="subscript"/>
-        </w:rPr>
-        <w:t xml:space="preserve">5</w:t>
-      </w:r>
-      <w:r>
-        <w:rPr>
-          <w:rFonts w:ascii="Times New Roman" w:hAnsi="Times New Roman" w:cs="Times New Roman"/>
-          <w:lang w:val="tr-TR"/>
-        </w:rPr>
-        <w:t xml:space="preserve">’in harcanma hızını NO</w:t>
-      </w:r>
-      <w:r>
-        <w:rPr>
-          <w:rFonts w:ascii="Times New Roman" w:hAnsi="Times New Roman" w:cs="Times New Roman"/>
-          <w:lang w:val="tr-TR"/>
-          <w:vertAlign w:val="subscript"/>
-        </w:rPr>
-        <w:t xml:space="preserve">2</w:t>
+        <w:t>Atölyede aynı zaman aralığında N</w:t>
+      </w:r>
+      <w:r>
+        <w:rPr>
+          <w:rFonts w:ascii="Times New Roman" w:hAnsi="Times New Roman" w:cs="Times New Roman"/>
+          <w:vertAlign w:val="subscript"/>
+          <w:lang w:val="tr-TR"/>
+        </w:rPr>
+        <w:t>2</w:t>
+      </w:r>
+      <w:r>
+        <w:rPr>
+          <w:rFonts w:ascii="Times New Roman" w:hAnsi="Times New Roman" w:cs="Times New Roman"/>
+          <w:lang w:val="tr-TR"/>
+        </w:rPr>
+        <w:t>O</w:t>
+      </w:r>
+      <w:r>
+        <w:rPr>
+          <w:rFonts w:ascii="Times New Roman" w:hAnsi="Times New Roman" w:cs="Times New Roman"/>
+          <w:vertAlign w:val="subscript"/>
+          <w:lang w:val="tr-TR"/>
+        </w:rPr>
+        <w:t>5</w:t>
+      </w:r>
+      <w:r>
+        <w:rPr>
+          <w:rFonts w:ascii="Times New Roman" w:hAnsi="Times New Roman" w:cs="Times New Roman"/>
+          <w:lang w:val="tr-TR"/>
+        </w:rPr>
+        <w:t>’in harcanma hızını NO</w:t>
+      </w:r>
+      <w:r>
+        <w:rPr>
+          <w:rFonts w:ascii="Times New Roman" w:hAnsi="Times New Roman" w:cs="Times New Roman"/>
+          <w:vertAlign w:val="subscript"/>
+          <w:lang w:val="tr-TR"/>
+        </w:rPr>
+        <w:t>2</w:t>
       </w:r>
       <w:r>
         <w:rPr>
@@ -3926,40 +3908,40 @@
       <w:r>
         <w:rPr>
           <w:rFonts w:ascii="Times New Roman" w:hAnsi="Times New Roman" w:cs="Times New Roman"/>
-          <w:lang w:val="tr-TR"/>
-          <w:vertAlign w:val="subscript"/>
-        </w:rPr>
-        <w:t xml:space="preserve">2</w:t>
-      </w:r>
-      <w:r>
-        <w:rPr>
-          <w:rFonts w:ascii="Times New Roman" w:hAnsi="Times New Roman" w:cs="Times New Roman"/>
-          <w:lang w:val="tr-TR"/>
-        </w:rPr>
-        <w:t xml:space="preserve">’nin oluşum hızlarıyla karşılaştırdığınızda bu hızların birbirinden farklı, ancak aralarındaki oranın her zaman aralığında aynı kaldığını fark etmiş olmalısınız. Bu durum, maddelerin harcanma ve oluşum hızlarının denkleştirilmiş tepkime denklemindeki katsayılarla orantılı olmasıyla açıklanabilir. Örneğin 2N</w:t>
-      </w:r>
-      <w:r>
-        <w:rPr>
-          <w:rFonts w:ascii="Times New Roman" w:hAnsi="Times New Roman" w:cs="Times New Roman"/>
-          <w:lang w:val="tr-TR"/>
-          <w:vertAlign w:val="subscript"/>
-        </w:rPr>
-        <w:t xml:space="preserve">2</w:t>
-      </w:r>
-      <w:r>
-        <w:rPr>
-          <w:rFonts w:ascii="Times New Roman" w:hAnsi="Times New Roman" w:cs="Times New Roman"/>
-          <w:lang w:val="tr-TR"/>
-        </w:rPr>
-        <w:t xml:space="preserve">O</w:t>
-      </w:r>
-      <w:r>
-        <w:rPr>
-          <w:rFonts w:ascii="Times New Roman" w:hAnsi="Times New Roman" w:cs="Times New Roman"/>
-          <w:lang w:val="tr-TR"/>
-          <w:vertAlign w:val="subscript"/>
-        </w:rPr>
-        <w:t xml:space="preserve">5</w:t>
+          <w:vertAlign w:val="subscript"/>
+          <w:lang w:val="tr-TR"/>
+        </w:rPr>
+        <w:t>2</w:t>
+      </w:r>
+      <w:r>
+        <w:rPr>
+          <w:rFonts w:ascii="Times New Roman" w:hAnsi="Times New Roman" w:cs="Times New Roman"/>
+          <w:lang w:val="tr-TR"/>
+        </w:rPr>
+        <w:t>’nin oluşum hızlarıyla karşılaştırdığınızda bu hızların birbirinden farklı, ancak aralarındaki oranın her zaman aralığında aynı kaldığını fark etmiş olmalısınız. Bu durum, maddelerin harcanma ve oluşum hızlarının denkleştirilmiş tepkime denklemindeki katsayılarla orantılı olmasıyla açıklanabilir. Örneğin 2N</w:t>
+      </w:r>
+      <w:r>
+        <w:rPr>
+          <w:rFonts w:ascii="Times New Roman" w:hAnsi="Times New Roman" w:cs="Times New Roman"/>
+          <w:vertAlign w:val="subscript"/>
+          <w:lang w:val="tr-TR"/>
+        </w:rPr>
+        <w:t>2</w:t>
+      </w:r>
+      <w:r>
+        <w:rPr>
+          <w:rFonts w:ascii="Times New Roman" w:hAnsi="Times New Roman" w:cs="Times New Roman"/>
+          <w:lang w:val="tr-TR"/>
+        </w:rPr>
+        <w:t>O</w:t>
+      </w:r>
+      <w:r>
+        <w:rPr>
+          <w:rFonts w:ascii="Times New Roman" w:hAnsi="Times New Roman" w:cs="Times New Roman"/>
+          <w:vertAlign w:val="subscript"/>
+          <w:lang w:val="tr-TR"/>
+        </w:rPr>
+        <w:t>5</w:t>
       </w:r>
       <w:r>
         <w:rPr>
@@ -3971,10 +3953,10 @@
       <w:r>
         <w:rPr>
           <w:rFonts w:ascii="Times New Roman" w:hAnsi="Times New Roman" w:cs="Times New Roman"/>
-          <w:lang w:val="tr-TR"/>
-          <w:vertAlign w:val="subscript"/>
-        </w:rPr>
-        <w:t xml:space="preserve">2</w:t>
+          <w:vertAlign w:val="subscript"/>
+          <w:lang w:val="tr-TR"/>
+        </w:rPr>
+        <w:t>2</w:t>
       </w:r>
       <w:r>
         <w:rPr>
@@ -3986,10 +3968,10 @@
       <w:r>
         <w:rPr>
           <w:rFonts w:ascii="Times New Roman" w:hAnsi="Times New Roman" w:cs="Times New Roman"/>
-          <w:lang w:val="tr-TR"/>
-          <w:vertAlign w:val="subscript"/>
-        </w:rPr>
-        <w:t xml:space="preserve">2</w:t>
+          <w:vertAlign w:val="subscript"/>
+          <w:lang w:val="tr-TR"/>
+        </w:rPr>
+        <w:t>2</w:t>
       </w:r>
       <w:r>
         <w:rPr>
@@ -4001,25 +3983,25 @@
       <w:r>
         <w:rPr>
           <w:rFonts w:ascii="Times New Roman" w:hAnsi="Times New Roman" w:cs="Times New Roman"/>
-          <w:lang w:val="tr-TR"/>
-          <w:vertAlign w:val="subscript"/>
-        </w:rPr>
-        <w:t xml:space="preserve">2</w:t>
-      </w:r>
-      <w:r>
-        <w:rPr>
-          <w:rFonts w:ascii="Times New Roman" w:hAnsi="Times New Roman" w:cs="Times New Roman"/>
-          <w:lang w:val="tr-TR"/>
-        </w:rPr>
-        <w:t xml:space="preserve">O</w:t>
-      </w:r>
-      <w:r>
-        <w:rPr>
-          <w:rFonts w:ascii="Times New Roman" w:hAnsi="Times New Roman" w:cs="Times New Roman"/>
-          <w:lang w:val="tr-TR"/>
-          <w:vertAlign w:val="subscript"/>
-        </w:rPr>
-        <w:t xml:space="preserve">5</w:t>
+          <w:vertAlign w:val="subscript"/>
+          <w:lang w:val="tr-TR"/>
+        </w:rPr>
+        <w:t>2</w:t>
+      </w:r>
+      <w:r>
+        <w:rPr>
+          <w:rFonts w:ascii="Times New Roman" w:hAnsi="Times New Roman" w:cs="Times New Roman"/>
+          <w:lang w:val="tr-TR"/>
+        </w:rPr>
+        <w:t>O</w:t>
+      </w:r>
+      <w:r>
+        <w:rPr>
+          <w:rFonts w:ascii="Times New Roman" w:hAnsi="Times New Roman" w:cs="Times New Roman"/>
+          <w:vertAlign w:val="subscript"/>
+          <w:lang w:val="tr-TR"/>
+        </w:rPr>
+        <w:t>5</w:t>
       </w:r>
       <w:r>
         <w:rPr>
@@ -4031,10 +4013,10 @@
       <w:r>
         <w:rPr>
           <w:rFonts w:ascii="Times New Roman" w:hAnsi="Times New Roman" w:cs="Times New Roman"/>
-          <w:lang w:val="tr-TR"/>
-          <w:vertAlign w:val="subscript"/>
-        </w:rPr>
-        <w:t xml:space="preserve">2</w:t>
+          <w:vertAlign w:val="subscript"/>
+          <w:lang w:val="tr-TR"/>
+        </w:rPr>
+        <w:t>2</w:t>
       </w:r>
       <w:r>
         <w:rPr>
@@ -4046,10 +4028,10 @@
       <w:r>
         <w:rPr>
           <w:rFonts w:ascii="Times New Roman" w:hAnsi="Times New Roman" w:cs="Times New Roman"/>
-          <w:lang w:val="tr-TR"/>
-          <w:vertAlign w:val="subscript"/>
-        </w:rPr>
-        <w:t xml:space="preserve">2</w:t>
+          <w:vertAlign w:val="subscript"/>
+          <w:lang w:val="tr-TR"/>
+        </w:rPr>
+        <w:t>2</w:t>
       </w:r>
       <w:r>
         <w:rPr>
@@ -4061,62 +4043,62 @@
       <w:r>
         <w:rPr>
           <w:rFonts w:ascii="Times New Roman" w:hAnsi="Times New Roman" w:cs="Times New Roman"/>
-          <w:lang w:val="tr-TR"/>
-          <w:vertAlign w:val="subscript"/>
-        </w:rPr>
-        <w:t xml:space="preserve">2</w:t>
-      </w:r>
-      <w:r>
-        <w:rPr>
-          <w:rFonts w:ascii="Times New Roman" w:hAnsi="Times New Roman" w:cs="Times New Roman"/>
-          <w:lang w:val="tr-TR"/>
-        </w:rPr>
-        <w:t xml:space="preserve">’nin oluşum hızı N</w:t>
-      </w:r>
-      <w:r>
-        <w:rPr>
-          <w:rFonts w:ascii="Times New Roman" w:hAnsi="Times New Roman" w:cs="Times New Roman"/>
-          <w:lang w:val="tr-TR"/>
-          <w:vertAlign w:val="subscript"/>
-        </w:rPr>
-        <w:t xml:space="preserve">2</w:t>
-      </w:r>
-      <w:r>
-        <w:rPr>
-          <w:rFonts w:ascii="Times New Roman" w:hAnsi="Times New Roman" w:cs="Times New Roman"/>
-          <w:lang w:val="tr-TR"/>
-        </w:rPr>
-        <w:t xml:space="preserve">O</w:t>
-      </w:r>
-      <w:r>
-        <w:rPr>
-          <w:rFonts w:ascii="Times New Roman" w:hAnsi="Times New Roman" w:cs="Times New Roman"/>
-          <w:lang w:val="tr-TR"/>
-          <w:vertAlign w:val="subscript"/>
-        </w:rPr>
-        <w:t xml:space="preserve">5</w:t>
-      </w:r>
-      <w:r>
-        <w:rPr>
-          <w:rFonts w:ascii="Times New Roman" w:hAnsi="Times New Roman" w:cs="Times New Roman"/>
-          <w:lang w:val="tr-TR"/>
-        </w:rPr>
-        <w:t xml:space="preserve">’in harcanma hızının iki katı, O</w:t>
-      </w:r>
-      <w:r>
-        <w:rPr>
-          <w:rFonts w:ascii="Times New Roman" w:hAnsi="Times New Roman" w:cs="Times New Roman"/>
-          <w:lang w:val="tr-TR"/>
-          <w:vertAlign w:val="subscript"/>
-        </w:rPr>
-        <w:t xml:space="preserve">2</w:t>
-      </w:r>
-      <w:r>
-        <w:rPr>
-          <w:rFonts w:ascii="Times New Roman" w:hAnsi="Times New Roman" w:cs="Times New Roman"/>
-          <w:lang w:val="tr-TR"/>
-        </w:rPr>
-        <w:t xml:space="preserve">’nin oluşum hızı ise yarısıdır. Tepkimenin hangi maddeye göre ifade edildiğinden bağımsız tek bir hız değeri elde etmek için her maddenin hızı, tepkime denklemindeki katsayısına bölünür:</w:t>
+          <w:vertAlign w:val="subscript"/>
+          <w:lang w:val="tr-TR"/>
+        </w:rPr>
+        <w:t>2</w:t>
+      </w:r>
+      <w:r>
+        <w:rPr>
+          <w:rFonts w:ascii="Times New Roman" w:hAnsi="Times New Roman" w:cs="Times New Roman"/>
+          <w:lang w:val="tr-TR"/>
+        </w:rPr>
+        <w:t>’nin oluşum hızı N</w:t>
+      </w:r>
+      <w:r>
+        <w:rPr>
+          <w:rFonts w:ascii="Times New Roman" w:hAnsi="Times New Roman" w:cs="Times New Roman"/>
+          <w:vertAlign w:val="subscript"/>
+          <w:lang w:val="tr-TR"/>
+        </w:rPr>
+        <w:t>2</w:t>
+      </w:r>
+      <w:r>
+        <w:rPr>
+          <w:rFonts w:ascii="Times New Roman" w:hAnsi="Times New Roman" w:cs="Times New Roman"/>
+          <w:lang w:val="tr-TR"/>
+        </w:rPr>
+        <w:t>O</w:t>
+      </w:r>
+      <w:r>
+        <w:rPr>
+          <w:rFonts w:ascii="Times New Roman" w:hAnsi="Times New Roman" w:cs="Times New Roman"/>
+          <w:vertAlign w:val="subscript"/>
+          <w:lang w:val="tr-TR"/>
+        </w:rPr>
+        <w:t>5</w:t>
+      </w:r>
+      <w:r>
+        <w:rPr>
+          <w:rFonts w:ascii="Times New Roman" w:hAnsi="Times New Roman" w:cs="Times New Roman"/>
+          <w:lang w:val="tr-TR"/>
+        </w:rPr>
+        <w:t>’in harcanma hızının iki katı, O</w:t>
+      </w:r>
+      <w:r>
+        <w:rPr>
+          <w:rFonts w:ascii="Times New Roman" w:hAnsi="Times New Roman" w:cs="Times New Roman"/>
+          <w:vertAlign w:val="subscript"/>
+          <w:lang w:val="tr-TR"/>
+        </w:rPr>
+        <w:t>2</w:t>
+      </w:r>
+      <w:r>
+        <w:rPr>
+          <w:rFonts w:ascii="Times New Roman" w:hAnsi="Times New Roman" w:cs="Times New Roman"/>
+          <w:lang w:val="tr-TR"/>
+        </w:rPr>
+        <w:t>’nin oluşum hızı ise yarısıdır. Tepkimenin hangi maddeye göre ifade edildiğinden bağımsız tek bir hız değeri elde etmek için her maddenin hızı, tepkime denklemindeki katsayısına bölünür:</w:t>
       </w:r>
     </w:p>
     <w:p>
@@ -4449,82 +4431,82 @@
           <w:rFonts w:ascii="Times New Roman" w:hAnsi="Times New Roman" w:cs="Times New Roman"/>
           <w:lang w:val="tr-TR"/>
         </w:rPr>
+        <w:t>Ortalama tepkime hızı, derişim-zaman grafiği üzerinde iki nokta arasını birleştiren doğrunun eğimi ile ilişkilidir (Grafik B). Tepkimenin başlangıcındaki zaman aralığında eğim büyük, ilerleyen zaman aralıklarında ise eğim küçüktür. Örneğin Analiz ve Keşif Atölyesi 1.6.’daki verilere göre N</w:t>
+      </w:r>
+      <w:r>
+        <w:rPr>
+          <w:rFonts w:ascii="Times New Roman" w:hAnsi="Times New Roman" w:cs="Times New Roman"/>
+          <w:vertAlign w:val="subscript"/>
+          <w:lang w:val="tr-TR"/>
+        </w:rPr>
+        <w:t>2</w:t>
+      </w:r>
+      <w:r>
+        <w:rPr>
+          <w:rFonts w:ascii="Times New Roman" w:hAnsi="Times New Roman" w:cs="Times New Roman"/>
+          <w:lang w:val="tr-TR"/>
+        </w:rPr>
+        <w:t>O</w:t>
+      </w:r>
+      <w:r>
+        <w:rPr>
+          <w:rFonts w:ascii="Times New Roman" w:hAnsi="Times New Roman" w:cs="Times New Roman"/>
+          <w:vertAlign w:val="subscript"/>
+          <w:lang w:val="tr-TR"/>
+        </w:rPr>
+        <w:t>5</w:t>
+      </w:r>
+      <w:r>
+        <w:rPr>
+          <w:rFonts w:ascii="Times New Roman" w:hAnsi="Times New Roman" w:cs="Times New Roman"/>
+          <w:lang w:val="tr-TR"/>
+        </w:rPr>
+        <w:t>’in harcanma hızı 0-400 s aralığında 9,0·10</w:t>
+      </w:r>
+      <w:r>
+        <w:rPr>
+          <w:rFonts w:ascii="Times New Roman" w:hAnsi="Times New Roman" w:cs="Times New Roman"/>
+          <w:vertAlign w:val="superscript"/>
+          <w:lang w:val="tr-TR"/>
+        </w:rPr>
+        <w:t>-6</w:t>
+      </w:r>
+      <w:r>
+        <w:rPr>
+          <w:rFonts w:ascii="Times New Roman" w:hAnsi="Times New Roman" w:cs="Times New Roman"/>
+          <w:lang w:val="tr-TR"/>
+        </w:rPr>
+        <w:t xml:space="preserve"> mol/L·s iken 2000-2400 s aralığında 3,5·10</w:t>
+      </w:r>
+      <w:r>
+        <w:rPr>
+          <w:rFonts w:ascii="Times New Roman" w:hAnsi="Times New Roman" w:cs="Times New Roman"/>
+          <w:vertAlign w:val="superscript"/>
+          <w:lang w:val="tr-TR"/>
+        </w:rPr>
+        <w:t>-6</w:t>
+      </w:r>
+      <w:r>
+        <w:rPr>
+          <w:rFonts w:ascii="Times New Roman" w:hAnsi="Times New Roman" w:cs="Times New Roman"/>
+          <w:lang w:val="tr-TR"/>
+        </w:rPr>
+        <w:t xml:space="preserve"> mol/L·s’ye düşmüştür.</w:t>
+      </w:r>
+    </w:p>
+    <w:p>
+      <w:pPr>
+        <w:jc w:val="center"/>
+        <w:rPr>
+          <w:rFonts w:ascii="Times New Roman" w:hAnsi="Times New Roman" w:cs="Times New Roman"/>
+          <w:lang w:val="tr-TR"/>
+        </w:rPr>
+      </w:pPr>
+      <w:r>
+        <w:rPr>
+          <w:noProof/>
+        </w:rPr>
         <w:lastRenderedPageBreak/>
-        <w:t>Ortalama tepkime hızı, derişim-zaman grafiği üzerinde iki nokta arasını birleştiren doğrunun eğimi ile ilişkilidir (Grafik B). Tepkimenin başlangıcındaki zaman aralığında eğim büyük, ilerleyen zaman aralıklarında ise eğim küçüktür. Örneğin Analiz ve Keşif Atölyesi 1.6.’daki verilere göre N</w:t>
-      </w:r>
-      <w:r>
-        <w:rPr>
-          <w:rFonts w:ascii="Times New Roman" w:hAnsi="Times New Roman" w:cs="Times New Roman"/>
-          <w:vertAlign w:val="subscript"/>
-          <w:lang w:val="tr-TR"/>
-        </w:rPr>
-        <w:t>2</w:t>
-      </w:r>
-      <w:r>
-        <w:rPr>
-          <w:rFonts w:ascii="Times New Roman" w:hAnsi="Times New Roman" w:cs="Times New Roman"/>
-          <w:lang w:val="tr-TR"/>
-        </w:rPr>
-        <w:t>O</w:t>
-      </w:r>
-      <w:r>
-        <w:rPr>
-          <w:rFonts w:ascii="Times New Roman" w:hAnsi="Times New Roman" w:cs="Times New Roman"/>
-          <w:vertAlign w:val="subscript"/>
-          <w:lang w:val="tr-TR"/>
-        </w:rPr>
-        <w:t>5</w:t>
-      </w:r>
-      <w:r>
-        <w:rPr>
-          <w:rFonts w:ascii="Times New Roman" w:hAnsi="Times New Roman" w:cs="Times New Roman"/>
-          <w:lang w:val="tr-TR"/>
-        </w:rPr>
-        <w:t>’in harcanma hızı 0-400 s aralığında 9,0·10</w:t>
-      </w:r>
-      <w:r>
-        <w:rPr>
-          <w:rFonts w:ascii="Times New Roman" w:hAnsi="Times New Roman" w:cs="Times New Roman"/>
-          <w:vertAlign w:val="superscript"/>
-          <w:lang w:val="tr-TR"/>
-        </w:rPr>
-        <w:t>-6</w:t>
-      </w:r>
-      <w:r>
-        <w:rPr>
-          <w:rFonts w:ascii="Times New Roman" w:hAnsi="Times New Roman" w:cs="Times New Roman"/>
-          <w:lang w:val="tr-TR"/>
-        </w:rPr>
-        <w:t xml:space="preserve"> mol/L·s iken 2000-2400 s aralığında 3,5·10</w:t>
-      </w:r>
-      <w:r>
-        <w:rPr>
-          <w:rFonts w:ascii="Times New Roman" w:hAnsi="Times New Roman" w:cs="Times New Roman"/>
-          <w:vertAlign w:val="superscript"/>
-          <w:lang w:val="tr-TR"/>
-        </w:rPr>
-        <w:t>-6</w:t>
-      </w:r>
-      <w:r>
-        <w:rPr>
-          <w:rFonts w:ascii="Times New Roman" w:hAnsi="Times New Roman" w:cs="Times New Roman"/>
-          <w:lang w:val="tr-TR"/>
-        </w:rPr>
-        <w:t xml:space="preserve"> mol/L·s’ye düşmüştür.</w:t>
-      </w:r>
-    </w:p>
-    <w:p>
-      <w:pPr>
-        <w:jc w:val="center"/>
-        <w:rPr>
-          <w:rFonts w:ascii="Times New Roman" w:hAnsi="Times New Roman" w:cs="Times New Roman"/>
-          <w:lang w:val="tr-TR"/>
-        </w:rPr>
-      </w:pPr>
-      <w:r>
-        <w:rPr>
-          <w:noProof/>
-        </w:rPr>
         <w:drawing>
           <wp:inline distT="0" distB="0" distL="0" distR="0" wp14:anchorId="3F4ABCB9" wp14:editId="3136C892">
             <wp:extent cx="5040000" cy="3087840"/>
@@ -4616,7 +4598,7 @@
           <w:rFonts w:ascii="Times New Roman" w:hAnsi="Times New Roman" w:cs="Times New Roman"/>
           <w:lang w:val="tr-TR"/>
         </w:rPr>
-        <w:t xml:space="preserve">Analiz ve Keşif Atölyesi 1.6.’da derişim değerleri size hazır bir tablo olarak verildi. Peki laboratuvarda bir tepkime sürerken tepken ve ürünlerin derişimlerini her an doğrudan ölçmek mümkün müdür?</w:t>
+        <w:t>Analiz ve Keşif Atölyesi 1.6.’da derişim değerleri size hazır bir tablo olarak verildi. Peki laboratuvarda bir tepkime sürerken tepken ve ürünlerin derişimlerini her an doğrudan ölçmek mümkün müdür?</w:t>
       </w:r>
     </w:p>
     <w:p>
@@ -4657,7 +4639,7 @@
           <w:bCs/>
           <w:lang w:val="tr-TR"/>
         </w:rPr>
-        <w:t xml:space="preserve">r</w:t>
+        <w:t>r</w:t>
       </w:r>
       <w:r>
         <w:rPr>
@@ -4682,7 +4664,7 @@
           <w:bCs/>
           <w:lang w:val="tr-TR"/>
         </w:rPr>
-        <w:t xml:space="preserve">Tablo A:</w:t>
+        <w:t>Tablo A:</w:t>
       </w:r>
       <w:r>
         <w:rPr>
@@ -4705,7 +4687,7 @@
           <w:insideV w:val="single" w:sz="4" w:space="0" w:color="auto"/>
         </w:tblBorders>
         <w:tblLayout w:type="fixed"/>
-        <w:tblLook w:val="04A0"/>
+        <w:tblLook w:val="04A0" w:firstRow="1" w:lastRow="0" w:firstColumn="1" w:lastColumn="0" w:noHBand="0" w:noVBand="1"/>
       </w:tblPr>
       <w:tblGrid>
         <w:gridCol w:w="2600"/>
@@ -4713,6 +4695,9 @@
         <w:gridCol w:w="3400"/>
       </w:tblGrid>
       <w:tr>
+        <w:trPr>
+          <w:jc w:val="center"/>
+        </w:trPr>
         <w:tc>
           <w:tcPr>
             <w:tcW w:w="2600" w:type="dxa"/>
@@ -4736,7 +4721,8 @@
                 <w:bCs/>
                 <w:lang w:val="tr-TR"/>
               </w:rPr>
-              <w:t xml:space="preserve">Ölçülen nicelik</w:t>
+              <w:lastRenderedPageBreak/>
+              <w:t>Ölçülen nicelik</w:t>
             </w:r>
           </w:p>
         </w:tc>
@@ -4763,7 +4749,7 @@
                 <w:bCs/>
                 <w:lang w:val="tr-TR"/>
               </w:rPr>
-              <w:t xml:space="preserve">Hız ifadesi</w:t>
+              <w:t>Hız ifadesi</w:t>
             </w:r>
           </w:p>
         </w:tc>
@@ -4790,12 +4776,15 @@
                 <w:bCs/>
                 <w:lang w:val="tr-TR"/>
               </w:rPr>
-              <w:t xml:space="preserve">Hız birimine örnekler</w:t>
+              <w:t>Hız birimine örnekler</w:t>
             </w:r>
           </w:p>
         </w:tc>
       </w:tr>
       <w:tr>
+        <w:trPr>
+          <w:jc w:val="center"/>
+        </w:trPr>
         <w:tc>
           <w:tcPr>
             <w:tcW w:w="2600" w:type="dxa"/>
@@ -4814,7 +4803,7 @@
                 <w:rFonts w:ascii="Times New Roman" w:hAnsi="Times New Roman" w:cs="Times New Roman"/>
                 <w:lang w:val="tr-TR"/>
               </w:rPr>
-              <w:t xml:space="preserve">Derişim</w:t>
+              <w:t>Derişim</w:t>
             </w:r>
           </w:p>
         </w:tc>
@@ -4836,7 +4825,7 @@
                 <w:rFonts w:ascii="Times New Roman" w:hAnsi="Times New Roman" w:cs="Times New Roman"/>
                 <w:lang w:val="tr-TR"/>
               </w:rPr>
-              <w:t xml:space="preserve">r = Δ[X]/Δt</w:t>
+              <w:t>r = Δ[X]/Δt</w:t>
             </w:r>
           </w:p>
         </w:tc>
@@ -4858,12 +4847,15 @@
                 <w:rFonts w:ascii="Times New Roman" w:hAnsi="Times New Roman" w:cs="Times New Roman"/>
                 <w:lang w:val="tr-TR"/>
               </w:rPr>
-              <w:t xml:space="preserve">mol/L·s, mol/L·dk</w:t>
+              <w:t>mol/L·s, mol/L·dk</w:t>
             </w:r>
           </w:p>
         </w:tc>
       </w:tr>
       <w:tr>
+        <w:trPr>
+          <w:jc w:val="center"/>
+        </w:trPr>
         <w:tc>
           <w:tcPr>
             <w:tcW w:w="2600" w:type="dxa"/>
@@ -4882,7 +4874,7 @@
                 <w:rFonts w:ascii="Times New Roman" w:hAnsi="Times New Roman" w:cs="Times New Roman"/>
                 <w:lang w:val="tr-TR"/>
               </w:rPr>
-              <w:t xml:space="preserve">Mol sayısı</w:t>
+              <w:t>Mol sayısı</w:t>
             </w:r>
           </w:p>
         </w:tc>
@@ -4904,7 +4896,7 @@
                 <w:rFonts w:ascii="Times New Roman" w:hAnsi="Times New Roman" w:cs="Times New Roman"/>
                 <w:lang w:val="tr-TR"/>
               </w:rPr>
-              <w:t xml:space="preserve">r = Δn/Δt</w:t>
+              <w:t>r = Δn/Δt</w:t>
             </w:r>
           </w:p>
         </w:tc>
@@ -4926,12 +4918,15 @@
                 <w:rFonts w:ascii="Times New Roman" w:hAnsi="Times New Roman" w:cs="Times New Roman"/>
                 <w:lang w:val="tr-TR"/>
               </w:rPr>
-              <w:t xml:space="preserve">mol/s, mol/dk</w:t>
+              <w:t>mol/s, mol/dk</w:t>
             </w:r>
           </w:p>
         </w:tc>
       </w:tr>
       <w:tr>
+        <w:trPr>
+          <w:jc w:val="center"/>
+        </w:trPr>
         <w:tc>
           <w:tcPr>
             <w:tcW w:w="2600" w:type="dxa"/>
@@ -4950,7 +4945,7 @@
                 <w:rFonts w:ascii="Times New Roman" w:hAnsi="Times New Roman" w:cs="Times New Roman"/>
                 <w:lang w:val="tr-TR"/>
               </w:rPr>
-              <w:t xml:space="preserve">Kütle</w:t>
+              <w:t>Kütle</w:t>
             </w:r>
           </w:p>
         </w:tc>
@@ -4972,7 +4967,7 @@
                 <w:rFonts w:ascii="Times New Roman" w:hAnsi="Times New Roman" w:cs="Times New Roman"/>
                 <w:lang w:val="tr-TR"/>
               </w:rPr>
-              <w:t xml:space="preserve">r = Δm/Δt</w:t>
+              <w:t>r = Δm/Δt</w:t>
             </w:r>
           </w:p>
         </w:tc>
@@ -4994,12 +4989,15 @@
                 <w:rFonts w:ascii="Times New Roman" w:hAnsi="Times New Roman" w:cs="Times New Roman"/>
                 <w:lang w:val="tr-TR"/>
               </w:rPr>
-              <w:t xml:space="preserve">g/s, g/dk</w:t>
+              <w:t>g/s, g/dk</w:t>
             </w:r>
           </w:p>
         </w:tc>
       </w:tr>
       <w:tr>
+        <w:trPr>
+          <w:jc w:val="center"/>
+        </w:trPr>
         <w:tc>
           <w:tcPr>
             <w:tcW w:w="2600" w:type="dxa"/>
@@ -5018,7 +5016,7 @@
                 <w:rFonts w:ascii="Times New Roman" w:hAnsi="Times New Roman" w:cs="Times New Roman"/>
                 <w:lang w:val="tr-TR"/>
               </w:rPr>
-              <w:t xml:space="preserve">Gaz hacmi</w:t>
+              <w:t>Gaz hacmi</w:t>
             </w:r>
           </w:p>
         </w:tc>
@@ -5040,7 +5038,7 @@
                 <w:rFonts w:ascii="Times New Roman" w:hAnsi="Times New Roman" w:cs="Times New Roman"/>
                 <w:lang w:val="tr-TR"/>
               </w:rPr>
-              <w:t xml:space="preserve">r = ΔV/Δt</w:t>
+              <w:t>r = ΔV/Δt</w:t>
             </w:r>
           </w:p>
         </w:tc>
@@ -5062,7 +5060,7 @@
                 <w:rFonts w:ascii="Times New Roman" w:hAnsi="Times New Roman" w:cs="Times New Roman"/>
                 <w:lang w:val="tr-TR"/>
               </w:rPr>
-              <w:t xml:space="preserve">mL/s, L/dk</w:t>
+              <w:t>mL/s, L/dk</w:t>
             </w:r>
           </w:p>
         </w:tc>
@@ -5090,7 +5088,7 @@
           <w:rFonts w:ascii="Times New Roman" w:hAnsi="Times New Roman" w:cs="Times New Roman"/>
           <w:lang w:val="tr-TR"/>
         </w:rPr>
-        <w:t xml:space="preserve">Katı ya da saf sıvı bir madde harcandıkça miktarıyla birlikte hacmi de aynı oranda azalır; birim hacimdeki madde miktarı ise değişmez. Bu nedenle katı ve saf sıvıların derişimi tepkime boyunca sabit kalır. Bu nedenle bu maddelerin harcanma hızları derişim yerine kütle ya da mol sayısındaki değişimle ifade edilir. Tepkenlerden biri katı olan tepkimelerde, katının yüzeyi fazla değişmediği ve diğer tepkenin derişimi büyük ölçüde azalmadığı sürece tepkime yaklaşık aynı hızla devam eder.</w:t>
+        <w:t>Katı ya da saf sıvı bir madde harcandıkça miktarıyla birlikte hacmi de aynı oranda azalır; birim hacimdeki madde miktarı ise değişmez. Bu nedenle katı ve saf sıvıların derişimi tepkime boyunca sabit kalır. Bu nedenle bu maddelerin harcanma hızları derişim yerine kütle ya da mol sayısındaki değişimle ifade edilir. Tepkenlerden biri katı olan tepkimelerde, katının yüzeyi fazla değişmediği ve diğer tepkenin derişimi büyük ölçüde azalmadığı sürece tepkime yaklaşık aynı hızla devam eder.</w:t>
       </w:r>
     </w:p>
     <w:p>
@@ -5112,91 +5110,91 @@
           <w:bCs/>
           <w:lang w:val="tr-TR"/>
         </w:rPr>
-        <w:t xml:space="preserve">Örnek-Çözüm Atölyesi 1.7.</w:t>
-      </w:r>
-    </w:p>
-    <w:p>
-      <w:pPr>
-        <w:jc w:val="both"/>
-        <w:rPr>
-          <w:rFonts w:ascii="Times New Roman" w:hAnsi="Times New Roman" w:cs="Times New Roman"/>
-          <w:lang w:val="tr-TR"/>
-        </w:rPr>
-      </w:pPr>
-      <w:r>
-        <w:rPr>
-          <w:rFonts w:ascii="Times New Roman" w:hAnsi="Times New Roman" w:cs="Times New Roman"/>
-          <w:lang w:val="tr-TR"/>
-        </w:rPr>
-        <w:t xml:space="preserve">CaCO</w:t>
-      </w:r>
-      <w:r>
-        <w:rPr>
-          <w:rFonts w:ascii="Times New Roman" w:hAnsi="Times New Roman" w:cs="Times New Roman"/>
-          <w:vertAlign w:val="subscript"/>
-          <w:lang w:val="tr-TR"/>
-        </w:rPr>
-        <w:t xml:space="preserve">3</w:t>
-      </w:r>
-      <w:r>
-        <w:rPr>
-          <w:rFonts w:ascii="Times New Roman" w:hAnsi="Times New Roman" w:cs="Times New Roman"/>
-          <w:lang w:val="tr-TR"/>
-        </w:rPr>
-        <w:t xml:space="preserve">(k) + 2HCl(suda) → CaCl</w:t>
-      </w:r>
-      <w:r>
-        <w:rPr>
-          <w:rFonts w:ascii="Times New Roman" w:hAnsi="Times New Roman" w:cs="Times New Roman"/>
-          <w:vertAlign w:val="subscript"/>
-          <w:lang w:val="tr-TR"/>
-        </w:rPr>
-        <w:t xml:space="preserve">2</w:t>
-      </w:r>
-      <w:r>
-        <w:rPr>
-          <w:rFonts w:ascii="Times New Roman" w:hAnsi="Times New Roman" w:cs="Times New Roman"/>
-          <w:lang w:val="tr-TR"/>
-        </w:rPr>
-        <w:t xml:space="preserve">(suda) + CO</w:t>
-      </w:r>
-      <w:r>
-        <w:rPr>
-          <w:rFonts w:ascii="Times New Roman" w:hAnsi="Times New Roman" w:cs="Times New Roman"/>
-          <w:vertAlign w:val="subscript"/>
-          <w:lang w:val="tr-TR"/>
-        </w:rPr>
-        <w:t xml:space="preserve">2</w:t>
-      </w:r>
-      <w:r>
-        <w:rPr>
-          <w:rFonts w:ascii="Times New Roman" w:hAnsi="Times New Roman" w:cs="Times New Roman"/>
-          <w:lang w:val="tr-TR"/>
-        </w:rPr>
-        <w:t xml:space="preserve">(g) + H</w:t>
-      </w:r>
-      <w:r>
-        <w:rPr>
-          <w:rFonts w:ascii="Times New Roman" w:hAnsi="Times New Roman" w:cs="Times New Roman"/>
-          <w:vertAlign w:val="subscript"/>
-          <w:lang w:val="tr-TR"/>
-        </w:rPr>
-        <w:t xml:space="preserve">2</w:t>
-      </w:r>
-      <w:r>
-        <w:rPr>
-          <w:rFonts w:ascii="Times New Roman" w:hAnsi="Times New Roman" w:cs="Times New Roman"/>
-          <w:lang w:val="tr-TR"/>
-        </w:rPr>
-        <w:t xml:space="preserve">O(s) tepkimesinde 50 saniyede 2,0 g CaCO</w:t>
-      </w:r>
-      <w:r>
-        <w:rPr>
-          <w:rFonts w:ascii="Times New Roman" w:hAnsi="Times New Roman" w:cs="Times New Roman"/>
-          <w:vertAlign w:val="subscript"/>
-          <w:lang w:val="tr-TR"/>
-        </w:rPr>
-        <w:t xml:space="preserve">3</w:t>
+        <w:t>Örnek-Çözüm Atölyesi 1.7.</w:t>
+      </w:r>
+    </w:p>
+    <w:p>
+      <w:pPr>
+        <w:jc w:val="both"/>
+        <w:rPr>
+          <w:rFonts w:ascii="Times New Roman" w:hAnsi="Times New Roman" w:cs="Times New Roman"/>
+          <w:lang w:val="tr-TR"/>
+        </w:rPr>
+      </w:pPr>
+      <w:r>
+        <w:rPr>
+          <w:rFonts w:ascii="Times New Roman" w:hAnsi="Times New Roman" w:cs="Times New Roman"/>
+          <w:lang w:val="tr-TR"/>
+        </w:rPr>
+        <w:t>CaCO</w:t>
+      </w:r>
+      <w:r>
+        <w:rPr>
+          <w:rFonts w:ascii="Times New Roman" w:hAnsi="Times New Roman" w:cs="Times New Roman"/>
+          <w:vertAlign w:val="subscript"/>
+          <w:lang w:val="tr-TR"/>
+        </w:rPr>
+        <w:t>3</w:t>
+      </w:r>
+      <w:r>
+        <w:rPr>
+          <w:rFonts w:ascii="Times New Roman" w:hAnsi="Times New Roman" w:cs="Times New Roman"/>
+          <w:lang w:val="tr-TR"/>
+        </w:rPr>
+        <w:t>(k) + 2HCl(suda) → CaCl</w:t>
+      </w:r>
+      <w:r>
+        <w:rPr>
+          <w:rFonts w:ascii="Times New Roman" w:hAnsi="Times New Roman" w:cs="Times New Roman"/>
+          <w:vertAlign w:val="subscript"/>
+          <w:lang w:val="tr-TR"/>
+        </w:rPr>
+        <w:t>2</w:t>
+      </w:r>
+      <w:r>
+        <w:rPr>
+          <w:rFonts w:ascii="Times New Roman" w:hAnsi="Times New Roman" w:cs="Times New Roman"/>
+          <w:lang w:val="tr-TR"/>
+        </w:rPr>
+        <w:t>(suda) + CO</w:t>
+      </w:r>
+      <w:r>
+        <w:rPr>
+          <w:rFonts w:ascii="Times New Roman" w:hAnsi="Times New Roman" w:cs="Times New Roman"/>
+          <w:vertAlign w:val="subscript"/>
+          <w:lang w:val="tr-TR"/>
+        </w:rPr>
+        <w:t>2</w:t>
+      </w:r>
+      <w:r>
+        <w:rPr>
+          <w:rFonts w:ascii="Times New Roman" w:hAnsi="Times New Roman" w:cs="Times New Roman"/>
+          <w:lang w:val="tr-TR"/>
+        </w:rPr>
+        <w:t>(g) + H</w:t>
+      </w:r>
+      <w:r>
+        <w:rPr>
+          <w:rFonts w:ascii="Times New Roman" w:hAnsi="Times New Roman" w:cs="Times New Roman"/>
+          <w:vertAlign w:val="subscript"/>
+          <w:lang w:val="tr-TR"/>
+        </w:rPr>
+        <w:t>2</w:t>
+      </w:r>
+      <w:r>
+        <w:rPr>
+          <w:rFonts w:ascii="Times New Roman" w:hAnsi="Times New Roman" w:cs="Times New Roman"/>
+          <w:lang w:val="tr-TR"/>
+        </w:rPr>
+        <w:t>O(s) tepkimesinde 50 saniyede 2,0 g CaCO</w:t>
+      </w:r>
+      <w:r>
+        <w:rPr>
+          <w:rFonts w:ascii="Times New Roman" w:hAnsi="Times New Roman" w:cs="Times New Roman"/>
+          <w:vertAlign w:val="subscript"/>
+          <w:lang w:val="tr-TR"/>
+        </w:rPr>
+        <w:t>3</w:t>
       </w:r>
       <w:r>
         <w:rPr>
@@ -5211,44 +5209,44 @@
           <w:vertAlign w:val="subscript"/>
           <w:lang w:val="tr-TR"/>
         </w:rPr>
-        <w:t xml:space="preserve">3</w:t>
-      </w:r>
-      <w:r>
-        <w:rPr>
-          <w:rFonts w:ascii="Times New Roman" w:hAnsi="Times New Roman" w:cs="Times New Roman"/>
-          <w:lang w:val="tr-TR"/>
-        </w:rPr>
-        <w:t xml:space="preserve">’ın ortalama harcanma hızını g/s ve mol/s, CO</w:t>
-      </w:r>
-      <w:r>
-        <w:rPr>
-          <w:rFonts w:ascii="Times New Roman" w:hAnsi="Times New Roman" w:cs="Times New Roman"/>
-          <w:vertAlign w:val="subscript"/>
-          <w:lang w:val="tr-TR"/>
-        </w:rPr>
-        <w:t xml:space="preserve">2</w:t>
-      </w:r>
-      <w:r>
-        <w:rPr>
-          <w:rFonts w:ascii="Times New Roman" w:hAnsi="Times New Roman" w:cs="Times New Roman"/>
-          <w:lang w:val="tr-TR"/>
-        </w:rPr>
-        <w:t xml:space="preserve">’nin ortalama oluşma hızını mol/s ve 0 °C, 1 atm koşullarında mL/s cinsinden hesaplayınız. (CaCO</w:t>
-      </w:r>
-      <w:r>
-        <w:rPr>
-          <w:rFonts w:ascii="Times New Roman" w:hAnsi="Times New Roman" w:cs="Times New Roman"/>
-          <w:vertAlign w:val="subscript"/>
-          <w:lang w:val="tr-TR"/>
-        </w:rPr>
-        <w:t xml:space="preserve">3</w:t>
-      </w:r>
-      <w:r>
-        <w:rPr>
-          <w:rFonts w:ascii="Times New Roman" w:hAnsi="Times New Roman" w:cs="Times New Roman"/>
-          <w:lang w:val="tr-TR"/>
-        </w:rPr>
-        <w:t xml:space="preserve">: 100 g/mol)</w:t>
+        <w:t>3</w:t>
+      </w:r>
+      <w:r>
+        <w:rPr>
+          <w:rFonts w:ascii="Times New Roman" w:hAnsi="Times New Roman" w:cs="Times New Roman"/>
+          <w:lang w:val="tr-TR"/>
+        </w:rPr>
+        <w:t>’ın ortalama harcanma hızını g/s ve mol/s, CO</w:t>
+      </w:r>
+      <w:r>
+        <w:rPr>
+          <w:rFonts w:ascii="Times New Roman" w:hAnsi="Times New Roman" w:cs="Times New Roman"/>
+          <w:vertAlign w:val="subscript"/>
+          <w:lang w:val="tr-TR"/>
+        </w:rPr>
+        <w:t>2</w:t>
+      </w:r>
+      <w:r>
+        <w:rPr>
+          <w:rFonts w:ascii="Times New Roman" w:hAnsi="Times New Roman" w:cs="Times New Roman"/>
+          <w:lang w:val="tr-TR"/>
+        </w:rPr>
+        <w:t>’nin ortalama oluşma hızını mol/s ve 0 °C, 1 atm koşullarında mL/s cinsinden hesaplayınız. (CaCO</w:t>
+      </w:r>
+      <w:r>
+        <w:rPr>
+          <w:rFonts w:ascii="Times New Roman" w:hAnsi="Times New Roman" w:cs="Times New Roman"/>
+          <w:vertAlign w:val="subscript"/>
+          <w:lang w:val="tr-TR"/>
+        </w:rPr>
+        <w:t>3</w:t>
+      </w:r>
+      <w:r>
+        <w:rPr>
+          <w:rFonts w:ascii="Times New Roman" w:hAnsi="Times New Roman" w:cs="Times New Roman"/>
+          <w:lang w:val="tr-TR"/>
+        </w:rPr>
+        <w:t>: 100 g/mol)</w:t>
       </w:r>
     </w:p>
     <w:p>
@@ -5266,62 +5264,62 @@
           <w:bCs/>
           <w:lang w:val="tr-TR"/>
         </w:rPr>
-        <w:t xml:space="preserve">Çözüm:</w:t>
-      </w:r>
-    </w:p>
-    <w:p>
-      <w:pPr>
-        <w:jc w:val="both"/>
-        <w:rPr>
-          <w:rFonts w:ascii="Times New Roman" w:hAnsi="Times New Roman" w:cs="Times New Roman"/>
-          <w:lang w:val="tr-TR"/>
-        </w:rPr>
-      </w:pPr>
-      <w:r>
-        <w:rPr>
-          <w:rFonts w:ascii="Times New Roman" w:hAnsi="Times New Roman" w:cs="Times New Roman"/>
-          <w:lang w:val="tr-TR"/>
-        </w:rPr>
-        <w:t xml:space="preserve">CaCO</w:t>
-      </w:r>
-      <w:r>
-        <w:rPr>
-          <w:rFonts w:ascii="Times New Roman" w:hAnsi="Times New Roman" w:cs="Times New Roman"/>
-          <w:vertAlign w:val="subscript"/>
-          <w:lang w:val="tr-TR"/>
-        </w:rPr>
-        <w:t xml:space="preserve">3</w:t>
-      </w:r>
-      <w:r>
-        <w:rPr>
-          <w:rFonts w:ascii="Times New Roman" w:hAnsi="Times New Roman" w:cs="Times New Roman"/>
-          <w:lang w:val="tr-TR"/>
-        </w:rPr>
-        <w:t xml:space="preserve">’ın harcanma hızı = 2,0 g / 50 s = 0,040 g/s</w:t>
-      </w:r>
-    </w:p>
-    <w:p>
-      <w:pPr>
-        <w:jc w:val="both"/>
-        <w:rPr>
-          <w:rFonts w:ascii="Times New Roman" w:hAnsi="Times New Roman" w:cs="Times New Roman"/>
-          <w:lang w:val="tr-TR"/>
-        </w:rPr>
-      </w:pPr>
-      <w:r>
-        <w:rPr>
-          <w:rFonts w:ascii="Times New Roman" w:hAnsi="Times New Roman" w:cs="Times New Roman"/>
-          <w:lang w:val="tr-TR"/>
-        </w:rPr>
-        <w:t xml:space="preserve">2,0 g CaCO</w:t>
-      </w:r>
-      <w:r>
-        <w:rPr>
-          <w:rFonts w:ascii="Times New Roman" w:hAnsi="Times New Roman" w:cs="Times New Roman"/>
-          <w:vertAlign w:val="subscript"/>
-          <w:lang w:val="tr-TR"/>
-        </w:rPr>
-        <w:t xml:space="preserve">3</w:t>
+        <w:t>Çözüm:</w:t>
+      </w:r>
+    </w:p>
+    <w:p>
+      <w:pPr>
+        <w:jc w:val="both"/>
+        <w:rPr>
+          <w:rFonts w:ascii="Times New Roman" w:hAnsi="Times New Roman" w:cs="Times New Roman"/>
+          <w:lang w:val="tr-TR"/>
+        </w:rPr>
+      </w:pPr>
+      <w:r>
+        <w:rPr>
+          <w:rFonts w:ascii="Times New Roman" w:hAnsi="Times New Roman" w:cs="Times New Roman"/>
+          <w:lang w:val="tr-TR"/>
+        </w:rPr>
+        <w:t>CaCO</w:t>
+      </w:r>
+      <w:r>
+        <w:rPr>
+          <w:rFonts w:ascii="Times New Roman" w:hAnsi="Times New Roman" w:cs="Times New Roman"/>
+          <w:vertAlign w:val="subscript"/>
+          <w:lang w:val="tr-TR"/>
+        </w:rPr>
+        <w:t>3</w:t>
+      </w:r>
+      <w:r>
+        <w:rPr>
+          <w:rFonts w:ascii="Times New Roman" w:hAnsi="Times New Roman" w:cs="Times New Roman"/>
+          <w:lang w:val="tr-TR"/>
+        </w:rPr>
+        <w:t>’ın harcanma hızı = 2,0 g / 50 s = 0,040 g/s</w:t>
+      </w:r>
+    </w:p>
+    <w:p>
+      <w:pPr>
+        <w:jc w:val="both"/>
+        <w:rPr>
+          <w:rFonts w:ascii="Times New Roman" w:hAnsi="Times New Roman" w:cs="Times New Roman"/>
+          <w:lang w:val="tr-TR"/>
+        </w:rPr>
+      </w:pPr>
+      <w:r>
+        <w:rPr>
+          <w:rFonts w:ascii="Times New Roman" w:hAnsi="Times New Roman" w:cs="Times New Roman"/>
+          <w:lang w:val="tr-TR"/>
+        </w:rPr>
+        <w:t>2,0 g CaCO</w:t>
+      </w:r>
+      <w:r>
+        <w:rPr>
+          <w:rFonts w:ascii="Times New Roman" w:hAnsi="Times New Roman" w:cs="Times New Roman"/>
+          <w:vertAlign w:val="subscript"/>
+          <w:lang w:val="tr-TR"/>
+        </w:rPr>
+        <w:t>3</w:t>
       </w:r>
       <w:r>
         <w:rPr>
@@ -5336,7 +5334,7 @@
           <w:vertAlign w:val="superscript"/>
           <w:lang w:val="tr-TR"/>
         </w:rPr>
-        <w:t xml:space="preserve">-4</w:t>
+        <w:t>-4</w:t>
       </w:r>
       <w:r>
         <w:rPr>
@@ -5359,15 +5357,15 @@
           <w:rFonts w:ascii="Times New Roman" w:hAnsi="Times New Roman" w:cs="Times New Roman"/>
           <w:lang w:val="tr-TR"/>
         </w:rPr>
-        <w:t xml:space="preserve">Tepkime denklemine göre 1 mol CaCO</w:t>
-      </w:r>
-      <w:r>
-        <w:rPr>
-          <w:rFonts w:ascii="Times New Roman" w:hAnsi="Times New Roman" w:cs="Times New Roman"/>
-          <w:vertAlign w:val="subscript"/>
-          <w:lang w:val="tr-TR"/>
-        </w:rPr>
-        <w:t xml:space="preserve">3</w:t>
+        <w:t>Tepkime denklemine göre 1 mol CaCO</w:t>
+      </w:r>
+      <w:r>
+        <w:rPr>
+          <w:rFonts w:ascii="Times New Roman" w:hAnsi="Times New Roman" w:cs="Times New Roman"/>
+          <w:vertAlign w:val="subscript"/>
+          <w:lang w:val="tr-TR"/>
+        </w:rPr>
+        <w:t>3</w:t>
       </w:r>
       <w:r>
         <w:rPr>
@@ -5382,7 +5380,7 @@
           <w:vertAlign w:val="subscript"/>
           <w:lang w:val="tr-TR"/>
         </w:rPr>
-        <w:t xml:space="preserve">2</w:t>
+        <w:t>2</w:t>
       </w:r>
       <w:r>
         <w:rPr>
@@ -5397,14 +5395,14 @@
           <w:vertAlign w:val="subscript"/>
           <w:lang w:val="tr-TR"/>
         </w:rPr>
-        <w:t xml:space="preserve">2</w:t>
-      </w:r>
-      <w:r>
-        <w:rPr>
-          <w:rFonts w:ascii="Times New Roman" w:hAnsi="Times New Roman" w:cs="Times New Roman"/>
-          <w:lang w:val="tr-TR"/>
-        </w:rPr>
-        <w:t xml:space="preserve">’nin oluşma hızı = 4,0·10</w:t>
+        <w:t>2</w:t>
+      </w:r>
+      <w:r>
+        <w:rPr>
+          <w:rFonts w:ascii="Times New Roman" w:hAnsi="Times New Roman" w:cs="Times New Roman"/>
+          <w:lang w:val="tr-TR"/>
+        </w:rPr>
+        <w:t>’nin oluşma hızı = 4,0·10</w:t>
       </w:r>
       <w:r>
         <w:rPr>
@@ -5412,7 +5410,7 @@
           <w:vertAlign w:val="superscript"/>
           <w:lang w:val="tr-TR"/>
         </w:rPr>
-        <w:t xml:space="preserve">-4</w:t>
+        <w:t>-4</w:t>
       </w:r>
       <w:r>
         <w:rPr>
@@ -5435,7 +5433,7 @@
           <w:rFonts w:ascii="Times New Roman" w:hAnsi="Times New Roman" w:cs="Times New Roman"/>
           <w:lang w:val="tr-TR"/>
         </w:rPr>
-        <w:t xml:space="preserve">0 °C ve 1 atm’de 1 mol gaz 22,4 L hacim kaplar: 4,0·10</w:t>
+        <w:t>0 °C ve 1 atm’de 1 mol gaz 22,4 L hacim kaplar: 4,0·10</w:t>
       </w:r>
       <w:r>
         <w:rPr>
@@ -5443,7 +5441,7 @@
           <w:vertAlign w:val="superscript"/>
           <w:lang w:val="tr-TR"/>
         </w:rPr>
-        <w:t xml:space="preserve">-4</w:t>
+        <w:t>-4</w:t>
       </w:r>
       <w:r>
         <w:rPr>
@@ -5569,7 +5567,6 @@
           <w:rFonts w:ascii="Times New Roman" w:hAnsi="Times New Roman" w:cs="Times New Roman"/>
           <w:lang w:val="tr-TR"/>
         </w:rPr>
-        <w:lastRenderedPageBreak/>
         <w:t>H</w:t>
       </w:r>
       <w:r>
@@ -5717,6 +5714,7 @@
               <w:rFonts w:ascii="Cambria Math" w:hAnsi="Cambria Math" w:cs="Cambria Math"/>
               <w:lang w:val="tr-TR"/>
             </w:rPr>
+            <w:lastRenderedPageBreak/>
             <m:t>a) H₂’nin harcanma hızı = -</m:t>
           </m:r>
           <m:f>
@@ -6832,6 +6830,7 @@
           <w:rFonts w:ascii="Times New Roman" w:hAnsi="Times New Roman" w:cs="Times New Roman"/>
           <w:lang w:val="tr-TR"/>
         </w:rPr>
+        <w:lastRenderedPageBreak/>
         <w:t>C</w:t>
       </w:r>
       <w:r>
@@ -7633,7 +7632,6 @@
                 <w:rFonts w:ascii="Times New Roman" w:hAnsi="Times New Roman" w:cs="Times New Roman"/>
                 <w:lang w:val="tr-TR"/>
               </w:rPr>
-              <w:lastRenderedPageBreak/>
               <w:t>[NO</w:t>
             </w:r>
             <w:r>
@@ -7857,6 +7855,7 @@
           <w:rFonts w:ascii="Times New Roman" w:hAnsi="Times New Roman" w:cs="Times New Roman"/>
           <w:lang w:val="tr-TR"/>
         </w:rPr>
+        <w:lastRenderedPageBreak/>
         <w:t>Hesaplama sonuçlarınızı tepkime hızının zamanla değişimi açısından çarpışma teorisi ile yorumlayınız.</w:t>
       </w:r>
     </w:p>
@@ -7910,52 +7909,52 @@
           <w:rFonts w:ascii="Times New Roman" w:hAnsi="Times New Roman" w:cs="Times New Roman"/>
           <w:lang w:val="tr-TR"/>
         </w:rPr>
-        <w:t xml:space="preserve">6. Zn(k) + 2HCl(suda) → ZnCl</w:t>
-      </w:r>
-      <w:r>
-        <w:rPr>
-          <w:rFonts w:ascii="Times New Roman" w:hAnsi="Times New Roman" w:cs="Times New Roman"/>
-          <w:vertAlign w:val="subscript"/>
-          <w:lang w:val="tr-TR"/>
-        </w:rPr>
-        <w:t xml:space="preserve">2</w:t>
-      </w:r>
-      <w:r>
-        <w:rPr>
-          <w:rFonts w:ascii="Times New Roman" w:hAnsi="Times New Roman" w:cs="Times New Roman"/>
-          <w:lang w:val="tr-TR"/>
-        </w:rPr>
-        <w:t xml:space="preserve">(suda) + H</w:t>
-      </w:r>
-      <w:r>
-        <w:rPr>
-          <w:rFonts w:ascii="Times New Roman" w:hAnsi="Times New Roman" w:cs="Times New Roman"/>
-          <w:vertAlign w:val="subscript"/>
-          <w:lang w:val="tr-TR"/>
-        </w:rPr>
-        <w:t xml:space="preserve">2</w:t>
-      </w:r>
-      <w:r>
-        <w:rPr>
-          <w:rFonts w:ascii="Times New Roman" w:hAnsi="Times New Roman" w:cs="Times New Roman"/>
-          <w:lang w:val="tr-TR"/>
-        </w:rPr>
-        <w:t xml:space="preserve">(g) tepkimesinde 2 dakikada 1,30 g Zn harcanmaktadır. Zn’nin ortalama harcanma hızını g/dk ve mol/dk, H</w:t>
-      </w:r>
-      <w:r>
-        <w:rPr>
-          <w:rFonts w:ascii="Times New Roman" w:hAnsi="Times New Roman" w:cs="Times New Roman"/>
-          <w:vertAlign w:val="subscript"/>
-          <w:lang w:val="tr-TR"/>
-        </w:rPr>
-        <w:t xml:space="preserve">2</w:t>
-      </w:r>
-      <w:r>
-        <w:rPr>
-          <w:rFonts w:ascii="Times New Roman" w:hAnsi="Times New Roman" w:cs="Times New Roman"/>
-          <w:lang w:val="tr-TR"/>
-        </w:rPr>
-        <w:t xml:space="preserve">’nin ortalama oluşma hızını mol/dk cinsinden hesaplayınız. (Zn: 65 g/mol)</w:t>
+        <w:t>6. Zn(k) + 2HCl(suda) → ZnCl</w:t>
+      </w:r>
+      <w:r>
+        <w:rPr>
+          <w:rFonts w:ascii="Times New Roman" w:hAnsi="Times New Roman" w:cs="Times New Roman"/>
+          <w:vertAlign w:val="subscript"/>
+          <w:lang w:val="tr-TR"/>
+        </w:rPr>
+        <w:t>2</w:t>
+      </w:r>
+      <w:r>
+        <w:rPr>
+          <w:rFonts w:ascii="Times New Roman" w:hAnsi="Times New Roman" w:cs="Times New Roman"/>
+          <w:lang w:val="tr-TR"/>
+        </w:rPr>
+        <w:t>(suda) + H</w:t>
+      </w:r>
+      <w:r>
+        <w:rPr>
+          <w:rFonts w:ascii="Times New Roman" w:hAnsi="Times New Roman" w:cs="Times New Roman"/>
+          <w:vertAlign w:val="subscript"/>
+          <w:lang w:val="tr-TR"/>
+        </w:rPr>
+        <w:t>2</w:t>
+      </w:r>
+      <w:r>
+        <w:rPr>
+          <w:rFonts w:ascii="Times New Roman" w:hAnsi="Times New Roman" w:cs="Times New Roman"/>
+          <w:lang w:val="tr-TR"/>
+        </w:rPr>
+        <w:t>(g) tepkimesinde 2 dakikada 1,30 g Zn harcanmaktadır. Zn’nin ortalama harcanma hızını g/dk ve mol/dk, H</w:t>
+      </w:r>
+      <w:r>
+        <w:rPr>
+          <w:rFonts w:ascii="Times New Roman" w:hAnsi="Times New Roman" w:cs="Times New Roman"/>
+          <w:vertAlign w:val="subscript"/>
+          <w:lang w:val="tr-TR"/>
+        </w:rPr>
+        <w:t>2</w:t>
+      </w:r>
+      <w:r>
+        <w:rPr>
+          <w:rFonts w:ascii="Times New Roman" w:hAnsi="Times New Roman" w:cs="Times New Roman"/>
+          <w:lang w:val="tr-TR"/>
+        </w:rPr>
+        <w:t>’nin ortalama oluşma hızını mol/dk cinsinden hesaplayınız. (Zn: 65 g/mol)</w:t>
       </w:r>
     </w:p>
     <w:tbl>
@@ -7968,6 +7967,7 @@
           <w:bottom w:val="single" w:sz="8" w:space="0" w:color="7F7F7F"/>
           <w:right w:val="single" w:sz="8" w:space="0" w:color="7F7F7F"/>
         </w:tblBorders>
+        <w:tblLook w:val="04A0" w:firstRow="1" w:lastRow="0" w:firstColumn="1" w:lastColumn="0" w:noHBand="0" w:noVBand="1"/>
       </w:tblPr>
       <w:tblGrid>
         <w:gridCol w:w="9000"/>
@@ -7975,6 +7975,7 @@
       <w:tr>
         <w:trPr>
           <w:trHeight w:val="1200"/>
+          <w:jc w:val="center"/>
         </w:trPr>
         <w:tc>
           <w:tcPr>
@@ -8006,7 +8007,7 @@
           <w:rFonts w:ascii="Times New Roman" w:hAnsi="Times New Roman" w:cs="Times New Roman"/>
           <w:lang w:val="tr-TR"/>
         </w:rPr>
-        <w:t xml:space="preserve">7. Katı tepkenin harcandığı bir tepkimede hızın derişim cinsinden ifade edilmemesinin nedenini açıklayınız.</w:t>
+        <w:t>7. Katı tepkenin harcandığı bir tepkimede hızın derişim cinsinden ifade edilmemesinin nedenini açıklayınız.</w:t>
       </w:r>
     </w:p>
     <w:p>
@@ -8023,7 +8024,7 @@
           <w:rFonts w:ascii="Times New Roman" w:hAnsi="Times New Roman" w:cs="Times New Roman"/>
           <w:lang w:val="tr-TR"/>
         </w:rPr>
-        <w:t xml:space="preserve">……………………………………………………………………………………………</w:t>
+        <w:t>……………………………………………………………………………………………</w:t>
       </w:r>
     </w:p>
     <w:p>
@@ -8040,7 +8041,7 @@
           <w:rFonts w:ascii="Times New Roman" w:hAnsi="Times New Roman" w:cs="Times New Roman"/>
           <w:lang w:val="tr-TR"/>
         </w:rPr>
-        <w:t xml:space="preserve">……………………………………………………………………………………………</w:t>
+        <w:t>……………………………………………………………………………………………</w:t>
       </w:r>
     </w:p>
     <w:p>
@@ -8324,6 +8325,7 @@
           <w:highlight w:val="yellow"/>
           <w:lang w:val="tr-TR"/>
         </w:rPr>
+        <w:lastRenderedPageBreak/>
         <w:t xml:space="preserve">NOT: </w:t>
       </w:r>
       <w:r>

</xml_diff>